<commit_message>
Grade-10 slide without the dark card; drop the removed chapter-01 slide (38 slides)
Co-Authored-By: Claude Opus 5.5 <noreply@anthropic.com>
Claude-Session: https://claude.ai/code/session_01VJ4ffGR4QBf998EQw4XNfv
</commit_message>
<xml_diff>
--- a/presentation/lecture-script.docx
+++ b/presentation/lecture-script.docx
@@ -309,7 +309,7 @@
           <w:szCs w:val="28"/>
           <w:rtl/>
         </w:rPr>
-        <w:t xml:space="preserve">שקופית 3 – פרק 01</w:t>
+        <w:t xml:space="preserve">שקופית 3 – חנוך, בן 24, מיישובי גדרות</w:t>
       </w:r>
     </w:p>
     <w:p>
@@ -340,7 +340,7 @@
           <w:szCs w:val="20"/>
           <w:rtl/>
         </w:rPr>
-        <w:t xml:space="preserve">שקופית פרק: 01 · מי הייתי לפני הכול.</w:t>
+        <w:t xml:space="preserve">הכותרת: חנוך, בן 24, מיישובי גדרות. תמונת ילדות שלך בשדה, עם סוסים ברקע.</w:t>
       </w:r>
     </w:p>
     <w:p>
@@ -357,6 +357,22 @@
           <w:rtl/>
         </w:rPr>
         <w:t xml:space="preserve">אז מי הייתי לפני כל זה?</w:t>
+      </w:r>
+    </w:p>
+    <w:p>
+      <w:pPr>
+        <w:bidi/>
+        <w:spacing w:after="140" w:line="360"/>
+        <w:jc w:val="right"/>
+      </w:pPr>
+      <w:r>
+        <w:rPr>
+          <w:rFonts w:ascii="Arial" w:cs="Arial" w:eastAsia="Arial" w:hAnsi="Arial"/>
+          <w:sz w:val="26"/>
+          <w:szCs w:val="26"/>
+          <w:rtl/>
+        </w:rPr>
+        <w:t xml:space="preserve">כמו שאמרתי, אני חנוך, בן 24, מיישובי גדרות. אני אח בכור לשלושה אחים, והייתה לי ילדות מושבניקית.</w:t>
       </w:r>
     </w:p>
     <w:p>
@@ -376,7 +392,7 @@
           <w:szCs w:val="28"/>
           <w:rtl/>
         </w:rPr>
-        <w:t xml:space="preserve">שקופית 4 – חנוך, בן 24, מיישובי גדרות</w:t>
+        <w:t xml:space="preserve">שקופית 4 – ילד בעייתי</w:t>
       </w:r>
     </w:p>
     <w:p>
@@ -407,23 +423,39 @@
           <w:szCs w:val="20"/>
           <w:rtl/>
         </w:rPr>
-        <w:t xml:space="preserve">הכותרת: חנוך, בן 24, מיישובי גדרות. תמונת ילדות שלך בשדה, עם סוסים ברקע.</w:t>
-      </w:r>
-    </w:p>
-    <w:p>
-      <w:pPr>
-        <w:bidi/>
-        <w:spacing w:after="140" w:line="360"/>
-        <w:jc w:val="right"/>
-      </w:pPr>
-      <w:r>
-        <w:rPr>
-          <w:rFonts w:ascii="Arial" w:cs="Arial" w:eastAsia="Arial" w:hAnsi="Arial"/>
-          <w:sz w:val="26"/>
-          <w:szCs w:val="26"/>
-          <w:rtl/>
-        </w:rPr>
-        <w:t xml:space="preserve">כמו שאמרתי, אני חנוך, בן 24, מיישובי גדרות. אני אח בכור לשלושה אחים, והייתה לי ילדות מושבניקית.</w:t>
+        <w:t xml:space="preserve">״ילד בעייתי״ בגדול, ולצידו תמונה שלך כילד עם תיק בית ספר. מתחת: ככה הגדירו אותי כבר מהגן. ומאז – הסתבכתי הרבה. כשאומרים לך משהו מספיק פעמים, אתה מתחיל להאמין לזה.</w:t>
+      </w:r>
+    </w:p>
+    <w:p>
+      <w:pPr>
+        <w:bidi/>
+        <w:spacing w:after="140" w:line="360"/>
+        <w:jc w:val="right"/>
+      </w:pPr>
+      <w:r>
+        <w:rPr>
+          <w:rFonts w:ascii="Arial" w:cs="Arial" w:eastAsia="Arial" w:hAnsi="Arial"/>
+          <w:sz w:val="26"/>
+          <w:szCs w:val="26"/>
+          <w:rtl/>
+        </w:rPr>
+        <w:t xml:space="preserve">מאז שהייתי בגן הגדירו אותי כילד בעייתי, ומאז הסתבכתי המון. כשאומרים לך משהו מספיק פעמים, אתה מתחיל להאמין בזה.</w:t>
+      </w:r>
+    </w:p>
+    <w:p>
+      <w:pPr>
+        <w:bidi/>
+        <w:spacing w:after="140" w:line="360"/>
+        <w:jc w:val="right"/>
+      </w:pPr>
+      <w:r>
+        <w:rPr>
+          <w:rFonts w:ascii="Arial" w:cs="Arial" w:eastAsia="Arial" w:hAnsi="Arial"/>
+          <w:sz w:val="26"/>
+          <w:szCs w:val="26"/>
+          <w:rtl/>
+        </w:rPr>
+        <w:t xml:space="preserve">הייתי עושה המון צרות. הייתי אלים, מתוסכל, והאמנתי לכל מה שאמרו לי: שאני מפלצת, שלא יוצא ממני כלום, שאני לא אהיה טוב בצבא.</w:t>
       </w:r>
     </w:p>
     <w:p>
@@ -443,7 +475,7 @@
           <w:szCs w:val="28"/>
           <w:rtl/>
         </w:rPr>
-        <w:t xml:space="preserve">שקופית 5 – ילד בעייתי</w:t>
+        <w:t xml:space="preserve">שקופית 5 – כיתה י׳: הרגע שבו הכול התהפך</w:t>
       </w:r>
     </w:p>
     <w:p>
@@ -474,39 +506,87 @@
           <w:szCs w:val="20"/>
           <w:rtl/>
         </w:rPr>
-        <w:t xml:space="preserve">״ילד בעייתי״ בגדול, ולצידו תמונה שלך כילד עם תיק בית ספר. מתחת: ככה הגדירו אותי כבר מהגן. ומאז – הסתבכתי הרבה. כשאומרים לך משהו מספיק פעמים, אתה מתחיל להאמין לזה.</w:t>
-      </w:r>
-    </w:p>
-    <w:p>
-      <w:pPr>
-        <w:bidi/>
-        <w:spacing w:after="140" w:line="360"/>
-        <w:jc w:val="right"/>
-      </w:pPr>
-      <w:r>
-        <w:rPr>
-          <w:rFonts w:ascii="Arial" w:cs="Arial" w:eastAsia="Arial" w:hAnsi="Arial"/>
-          <w:sz w:val="26"/>
-          <w:szCs w:val="26"/>
-          <w:rtl/>
-        </w:rPr>
-        <w:t xml:space="preserve">מאז שהייתי בגן הגדירו אותי כילד בעייתי, ומאז הסתבכתי המון. כשאומרים לך משהו מספיק פעמים, אתה מתחיל להאמין בזה.</w:t>
-      </w:r>
-    </w:p>
-    <w:p>
-      <w:pPr>
-        <w:bidi/>
-        <w:spacing w:after="140" w:line="360"/>
-        <w:jc w:val="right"/>
-      </w:pPr>
-      <w:r>
-        <w:rPr>
-          <w:rFonts w:ascii="Arial" w:cs="Arial" w:eastAsia="Arial" w:hAnsi="Arial"/>
-          <w:sz w:val="26"/>
-          <w:szCs w:val="26"/>
-          <w:rtl/>
-        </w:rPr>
-        <w:t xml:space="preserve">הייתי עושה המון צרות. הייתי אלים, מתוסכל, והאמנתי לכל מה שאמרו לי: שאני מפלצת, שלא יוצא ממני כלום, שאני לא אהיה טוב בצבא.</w:t>
+        <w:t xml:space="preserve">הכותרת, ומתחתיה שלוש מילים גדולות: ההאשמה, ההבנה, ההחלטה.</w:t>
+      </w:r>
+    </w:p>
+    <w:p>
+      <w:pPr>
+        <w:bidi/>
+        <w:spacing w:after="140" w:line="360"/>
+        <w:jc w:val="right"/>
+      </w:pPr>
+      <w:r>
+        <w:rPr>
+          <w:rFonts w:ascii="Arial" w:cs="Arial" w:eastAsia="Arial" w:hAnsi="Arial"/>
+          <w:sz w:val="26"/>
+          <w:szCs w:val="26"/>
+          <w:rtl/>
+        </w:rPr>
+        <w:t xml:space="preserve">עד הרגע שבו הכול התהפך.</w:t>
+      </w:r>
+    </w:p>
+    <w:p>
+      <w:pPr>
+        <w:bidi/>
+        <w:spacing w:after="140" w:line="360"/>
+        <w:jc w:val="right"/>
+      </w:pPr>
+      <w:r>
+        <w:rPr>
+          <w:rFonts w:ascii="Arial" w:cs="Arial" w:eastAsia="Arial" w:hAnsi="Arial"/>
+          <w:sz w:val="26"/>
+          <w:szCs w:val="26"/>
+          <w:rtl/>
+        </w:rPr>
+        <w:t xml:space="preserve">כשהייתי בכיתה י׳ עבדתי בתור שוטף כלים במושב, וקיבלתי כל מיני טיפים של 20 שקל. עשיתי מהם מין סטפה כזאת, והלכתי איתה למכונות השתייה שהיו בבית הספר.</w:t>
+      </w:r>
+    </w:p>
+    <w:p>
+      <w:pPr>
+        <w:bidi/>
+        <w:spacing w:after="140" w:line="360"/>
+        <w:jc w:val="right"/>
+      </w:pPr>
+      <w:r>
+        <w:rPr>
+          <w:rFonts w:ascii="Arial" w:cs="Arial" w:eastAsia="Arial" w:hAnsi="Arial"/>
+          <w:sz w:val="26"/>
+          <w:szCs w:val="26"/>
+          <w:rtl/>
+        </w:rPr>
+        <w:t xml:space="preserve">המחנך שלי ראה אותי עם כל הכסף הזה, בא אליי ולחש לי באוזן: "תגיע למשרד של המנהל. עכשיו." בגדול, האשימו אותי בסחר בסמים.</w:t>
+      </w:r>
+    </w:p>
+    <w:p>
+      <w:pPr>
+        <w:bidi/>
+        <w:spacing w:after="140" w:line="360"/>
+        <w:jc w:val="right"/>
+      </w:pPr>
+      <w:r>
+        <w:rPr>
+          <w:rFonts w:ascii="Arial" w:cs="Arial" w:eastAsia="Arial" w:hAnsi="Arial"/>
+          <w:sz w:val="26"/>
+          <w:szCs w:val="26"/>
+          <w:rtl/>
+        </w:rPr>
+        <w:t xml:space="preserve">כמובן שלא היה לי שום קשר לזה, ואני הייתי בהלם שיכולים להאשים אותי בדבר כזה. פתאום נפלה לי ההבנה: כל מה שקשור לעולם הזה לא קשור אליי, וכל מה שאמרו לי על עצמי לא נכון.</w:t>
+      </w:r>
+    </w:p>
+    <w:p>
+      <w:pPr>
+        <w:bidi/>
+        <w:spacing w:after="140" w:line="360"/>
+        <w:jc w:val="right"/>
+      </w:pPr>
+      <w:r>
+        <w:rPr>
+          <w:rFonts w:ascii="Arial" w:cs="Arial" w:eastAsia="Arial" w:hAnsi="Arial"/>
+          <w:sz w:val="26"/>
+          <w:szCs w:val="26"/>
+          <w:rtl/>
+        </w:rPr>
+        <w:t xml:space="preserve">מאותו רגע החלטתי שאני הולך לשנות את זה, ולבנות לעצמי תדמית של בן אדם טוב.</w:t>
       </w:r>
     </w:p>
     <w:p>
@@ -526,138 +606,7 @@
           <w:szCs w:val="28"/>
           <w:rtl/>
         </w:rPr>
-        <w:t xml:space="preserve">שקופית 6 – כיתה י׳: הרגע שבו הכול התהפך</w:t>
-      </w:r>
-    </w:p>
-    <w:p>
-      <w:pPr>
-        <w:keepNext/>
-        <w:shd w:fill="F4F1EC" w:color="auto" w:val="clear"/>
-        <w:bidi/>
-        <w:spacing w:after="140"/>
-        <w:jc w:val="right"/>
-      </w:pPr>
-      <w:r>
-        <w:rPr>
-          <w:rFonts w:ascii="Arial" w:cs="Arial" w:eastAsia="Arial" w:hAnsi="Arial"/>
-          <w:b/>
-          <w:bCs/>
-          <w:color w:val="8A8F99"/>
-          <w:sz w:val="20"/>
-          <w:szCs w:val="20"/>
-          <w:rtl/>
-        </w:rPr>
-        <w:t xml:space="preserve">על המסך: </w:t>
-      </w:r>
-      <w:r>
-        <w:rPr>
-          <w:rFonts w:ascii="Arial" w:cs="Arial" w:eastAsia="Arial" w:hAnsi="Arial"/>
-          <w:color w:val="8A8F99"/>
-          <w:sz w:val="20"/>
-          <w:szCs w:val="20"/>
-          <w:rtl/>
-        </w:rPr>
-        <w:t xml:space="preserve">שלוש מילים: ההאשמה, ההבנה, ההחלטה. בכרטיס כהה: לא היה לי שום קשר לזה. והבנתי: אם אני לא אכתוב את הסיפור שלי – מישהו אחר יכתוב אותו בשבילי.</w:t>
-      </w:r>
-    </w:p>
-    <w:p>
-      <w:pPr>
-        <w:bidi/>
-        <w:spacing w:after="140" w:line="360"/>
-        <w:jc w:val="right"/>
-      </w:pPr>
-      <w:r>
-        <w:rPr>
-          <w:rFonts w:ascii="Arial" w:cs="Arial" w:eastAsia="Arial" w:hAnsi="Arial"/>
-          <w:sz w:val="26"/>
-          <w:szCs w:val="26"/>
-          <w:rtl/>
-        </w:rPr>
-        <w:t xml:space="preserve">עד הרגע שבו הכול התהפך.</w:t>
-      </w:r>
-    </w:p>
-    <w:p>
-      <w:pPr>
-        <w:bidi/>
-        <w:spacing w:after="140" w:line="360"/>
-        <w:jc w:val="right"/>
-      </w:pPr>
-      <w:r>
-        <w:rPr>
-          <w:rFonts w:ascii="Arial" w:cs="Arial" w:eastAsia="Arial" w:hAnsi="Arial"/>
-          <w:sz w:val="26"/>
-          <w:szCs w:val="26"/>
-          <w:rtl/>
-        </w:rPr>
-        <w:t xml:space="preserve">כשהייתי בכיתה י׳ עבדתי בתור שוטף כלים במושב, וקיבלתי כל מיני טיפים של 20 שקל. עשיתי מהם מין סטפה כזאת, והלכתי איתה למכונות השתייה שהיו בבית הספר.</w:t>
-      </w:r>
-    </w:p>
-    <w:p>
-      <w:pPr>
-        <w:bidi/>
-        <w:spacing w:after="140" w:line="360"/>
-        <w:jc w:val="right"/>
-      </w:pPr>
-      <w:r>
-        <w:rPr>
-          <w:rFonts w:ascii="Arial" w:cs="Arial" w:eastAsia="Arial" w:hAnsi="Arial"/>
-          <w:sz w:val="26"/>
-          <w:szCs w:val="26"/>
-          <w:rtl/>
-        </w:rPr>
-        <w:t xml:space="preserve">המחנך שלי ראה אותי עם כל הכסף הזה, בא אליי ולחש לי באוזן: "תגיע למשרד של המנהל. עכשיו." בגדול, האשימו אותי בסחר בסמים.</w:t>
-      </w:r>
-    </w:p>
-    <w:p>
-      <w:pPr>
-        <w:bidi/>
-        <w:spacing w:after="140" w:line="360"/>
-        <w:jc w:val="right"/>
-      </w:pPr>
-      <w:r>
-        <w:rPr>
-          <w:rFonts w:ascii="Arial" w:cs="Arial" w:eastAsia="Arial" w:hAnsi="Arial"/>
-          <w:sz w:val="26"/>
-          <w:szCs w:val="26"/>
-          <w:rtl/>
-        </w:rPr>
-        <w:t xml:space="preserve">כמובן שלא היה לי שום קשר לזה, ואני הייתי בהלם שיכולים להאשים אותי בדבר כזה. פתאום נפלה לי ההבנה: כל מה שקשור לעולם הזה לא קשור אליי, וכל מה שאמרו לי על עצמי לא נכון.</w:t>
-      </w:r>
-    </w:p>
-    <w:p>
-      <w:pPr>
-        <w:bidi/>
-        <w:spacing w:after="140" w:line="360"/>
-        <w:jc w:val="right"/>
-      </w:pPr>
-      <w:r>
-        <w:rPr>
-          <w:rFonts w:ascii="Arial" w:cs="Arial" w:eastAsia="Arial" w:hAnsi="Arial"/>
-          <w:sz w:val="26"/>
-          <w:szCs w:val="26"/>
-          <w:rtl/>
-        </w:rPr>
-        <w:t xml:space="preserve">מאותו רגע החלטתי שאני הולך לשנות את זה, ולבנות לעצמי תדמית של בן אדם טוב.</w:t>
-      </w:r>
-    </w:p>
-    <w:p>
-      <w:pPr>
-        <w:pStyle w:val="Heading2"/>
-        <w:keepNext/>
-        <w:bidi/>
-        <w:spacing w:after="80" w:before="320"/>
-        <w:jc w:val="right"/>
-      </w:pPr>
-      <w:r>
-        <w:rPr>
-          <w:rFonts w:ascii="Arial" w:cs="Arial" w:eastAsia="Arial" w:hAnsi="Arial"/>
-          <w:b/>
-          <w:bCs/>
-          <w:sz w:val="28"/>
-          <w:szCs w:val="28"/>
-          <w:rtl/>
-        </w:rPr>
-        <w:t xml:space="preserve">שקופית 7 – העבר שלך מסביר אותך</w:t>
+        <w:t xml:space="preserve">שקופית 6 – העבר שלך מסביר אותך</w:t>
       </w:r>
     </w:p>
     <w:p>
@@ -788,7 +737,7 @@
           <w:szCs w:val="28"/>
           <w:rtl/>
         </w:rPr>
-        <w:t xml:space="preserve">שקופית 8 – פרק 02, הבחירה</w:t>
+        <w:t xml:space="preserve">שקופית 7 – פרק 02, הבחירה</w:t>
       </w:r>
     </w:p>
     <w:p>
@@ -871,7 +820,7 @@
           <w:szCs w:val="28"/>
           <w:rtl/>
         </w:rPr>
-        <w:t xml:space="preserve">שקופית 9 – השירות הצבאי</w:t>
+        <w:t xml:space="preserve">שקופית 8 – השירות הצבאי</w:t>
       </w:r>
     </w:p>
     <w:p>
@@ -970,7 +919,7 @@
           <w:szCs w:val="28"/>
           <w:rtl/>
         </w:rPr>
-        <w:t xml:space="preserve">שקופית 10 – שני מפקדים. שני שיעורים</w:t>
+        <w:t xml:space="preserve">שקופית 9 – שני מפקדים. שני שיעורים</w:t>
       </w:r>
     </w:p>
     <w:p>
@@ -1146,7 +1095,7 @@
           <w:szCs w:val="28"/>
           <w:rtl/>
         </w:rPr>
-        <w:t xml:space="preserve">שקופית 11 – פרק 03</w:t>
+        <w:t xml:space="preserve">שקופית 10 – פרק 03</w:t>
       </w:r>
     </w:p>
     <w:p>
@@ -1213,7 +1162,7 @@
           <w:szCs w:val="28"/>
           <w:rtl/>
         </w:rPr>
-        <w:t xml:space="preserve">שקופית 12 – הגזרה הדרומית</w:t>
+        <w:t xml:space="preserve">שקופית 11 – הגזרה הדרומית</w:t>
       </w:r>
     </w:p>
     <w:p>
@@ -1280,7 +1229,7 @@
           <w:szCs w:val="28"/>
           <w:rtl/>
         </w:rPr>
-        <w:t xml:space="preserve">שקופית 13 – איך זה עבד בגזרה</w:t>
+        <w:t xml:space="preserve">שקופית 12 – איך זה עבד בגזרה</w:t>
       </w:r>
     </w:p>
     <w:p>
@@ -1363,7 +1312,7 @@
           <w:szCs w:val="28"/>
           <w:rtl/>
         </w:rPr>
-        <w:t xml:space="preserve">שקופית 14 – מה זה נגמ״ש?</w:t>
+        <w:t xml:space="preserve">שקופית 13 – מה זה נגמ״ש?</w:t>
       </w:r>
     </w:p>
     <w:p>
@@ -1430,7 +1379,7 @@
           <w:szCs w:val="28"/>
           <w:rtl/>
         </w:rPr>
-        <w:t xml:space="preserve">שקופית 15 – עליתי למשמרת</w:t>
+        <w:t xml:space="preserve">שקופית 14 – עליתי למשמרת</w:t>
       </w:r>
     </w:p>
     <w:p>
@@ -1513,7 +1462,7 @@
           <w:szCs w:val="28"/>
           <w:rtl/>
         </w:rPr>
-        <w:t xml:space="preserve">שקופית 16 – 06:29</w:t>
+        <w:t xml:space="preserve">שקופית 15 – 06:29</w:t>
       </w:r>
     </w:p>
     <w:p>
@@ -1599,7 +1548,7 @@
           <w:szCs w:val="28"/>
           <w:rtl/>
         </w:rPr>
-        <w:t xml:space="preserve">שקופית 17 – הקלטת קשר: הסמג״ד מכריז על מלחמה</w:t>
+        <w:t xml:space="preserve">שקופית 16 – הקלטת קשר: הסמג״ד מכריז על מלחמה</w:t>
       </w:r>
     </w:p>
     <w:p>
@@ -1685,7 +1634,7 @@
           <w:szCs w:val="28"/>
           <w:rtl/>
         </w:rPr>
-        <w:t xml:space="preserve">שקופית 18 – מהצד השני של הכביש</w:t>
+        <w:t xml:space="preserve">שקופית 17 – מהצד השני של הכביש</w:t>
       </w:r>
     </w:p>
     <w:p>
@@ -1771,7 +1720,7 @@
           <w:szCs w:val="28"/>
           <w:rtl/>
         </w:rPr>
-        <w:t xml:space="preserve">שקופית 19 – מפת הקרב</w:t>
+        <w:t xml:space="preserve">שקופית 18 – מפת הקרב</w:t>
       </w:r>
     </w:p>
     <w:p>
@@ -1838,7 +1787,7 @@
           <w:szCs w:val="28"/>
           <w:rtl/>
         </w:rPr>
-        <w:t xml:space="preserve">שקופית 20 – בינתיים, בתוך המוצב</w:t>
+        <w:t xml:space="preserve">שקופית 19 – בינתיים, בתוך המוצב</w:t>
       </w:r>
     </w:p>
     <w:p>
@@ -1924,7 +1873,7 @@
           <w:szCs w:val="28"/>
           <w:rtl/>
         </w:rPr>
-        <w:t xml:space="preserve">שקופית 21 – באותו רגע שנפצעתי</w:t>
+        <w:t xml:space="preserve">שקופית 20 – באותו רגע שנפצעתי</w:t>
       </w:r>
     </w:p>
     <w:p>
@@ -2138,7 +2087,7 @@
           <w:szCs w:val="28"/>
           <w:rtl/>
         </w:rPr>
-        <w:t xml:space="preserve">שקופית 22 – הקלטת קשר: הסמל מבקש פינוי</w:t>
+        <w:t xml:space="preserve">שקופית 21 – הקלטת קשר: הסמל מבקש פינוי</w:t>
       </w:r>
     </w:p>
     <w:p>
@@ -2240,7 +2189,7 @@
           <w:szCs w:val="28"/>
           <w:rtl/>
         </w:rPr>
-        <w:t xml:space="preserve">שקופית 23 – הנגמ״ש שלנו</w:t>
+        <w:t xml:space="preserve">שקופית 22 – הנגמ״ש שלנו</w:t>
       </w:r>
     </w:p>
     <w:p>
@@ -2307,7 +2256,7 @@
           <w:szCs w:val="28"/>
           <w:rtl/>
         </w:rPr>
-        <w:t xml:space="preserve">שקופית 24 – הקלטת קשר: כולם מבקשים פינוי</w:t>
+        <w:t xml:space="preserve">שקופית 23 – הקלטת קשר: כולם מבקשים פינוי</w:t>
       </w:r>
     </w:p>
     <w:p>
@@ -2409,7 +2358,7 @@
           <w:szCs w:val="28"/>
           <w:rtl/>
         </w:rPr>
-        <w:t xml:space="preserve">שקופית 25 – הקלטת קשר: קליין נותן פקודה</w:t>
+        <w:t xml:space="preserve">שקופית 24 – הקלטת קשר: קליין נותן פקודה</w:t>
       </w:r>
     </w:p>
     <w:p>
@@ -2495,7 +2444,7 @@
           <w:szCs w:val="28"/>
           <w:rtl/>
         </w:rPr>
-        <w:t xml:space="preserve">שקופית 26 – הפינוי</w:t>
+        <w:t xml:space="preserve">שקופית 25 – הפינוי</w:t>
       </w:r>
     </w:p>
     <w:p>
@@ -2562,7 +2511,7 @@
           <w:szCs w:val="28"/>
           <w:rtl/>
         </w:rPr>
-        <w:t xml:space="preserve">שקופית 27 – ההודעה הקולית מסורוקה</w:t>
+        <w:t xml:space="preserve">שקופית 26 – ההודעה הקולית מסורוקה</w:t>
       </w:r>
     </w:p>
     <w:p>
@@ -2664,7 +2613,7 @@
           <w:szCs w:val="28"/>
           <w:rtl/>
         </w:rPr>
-        <w:t xml:space="preserve">שקופית 28 – האמת?</w:t>
+        <w:t xml:space="preserve">שקופית 27 – האמת?</w:t>
       </w:r>
     </w:p>
     <w:p>
@@ -2795,7 +2744,7 @@
           <w:szCs w:val="28"/>
           <w:rtl/>
         </w:rPr>
-        <w:t xml:space="preserve">שקופית 29 – פרק 04</w:t>
+        <w:t xml:space="preserve">שקופית 28 – פרק 04</w:t>
       </w:r>
     </w:p>
     <w:p>
@@ -2862,7 +2811,7 @@
           <w:szCs w:val="28"/>
           <w:rtl/>
         </w:rPr>
-        <w:t xml:space="preserve">שקופית 30 – הדבר הכי קשה לא היה הפציעה</w:t>
+        <w:t xml:space="preserve">שקופית 29 – הדבר הכי קשה לא היה הפציעה</w:t>
       </w:r>
     </w:p>
     <w:p>
@@ -2996,7 +2945,7 @@
           <w:szCs w:val="28"/>
           <w:rtl/>
         </w:rPr>
-        <w:t xml:space="preserve">שקופית 31 – מה שאף אחד לא מכין אותך אליו</w:t>
+        <w:t xml:space="preserve">שקופית 30 – מה שאף אחד לא מכין אותך אליו</w:t>
       </w:r>
     </w:p>
     <w:p>
@@ -3127,7 +3076,7 @@
           <w:szCs w:val="28"/>
           <w:rtl/>
         </w:rPr>
-        <w:t xml:space="preserve">שקופית 32 – מאז</w:t>
+        <w:t xml:space="preserve">שקופית 31 – מאז</w:t>
       </w:r>
     </w:p>
     <w:p>
@@ -3223,7 +3172,7 @@
           <w:szCs w:val="28"/>
           <w:rtl/>
         </w:rPr>
-        <w:t xml:space="preserve">שקופית 33 – פרק 05</w:t>
+        <w:t xml:space="preserve">שקופית 32 – פרק 05</w:t>
       </w:r>
     </w:p>
     <w:p>
@@ -3290,7 +3239,7 @@
           <w:szCs w:val="28"/>
           <w:rtl/>
         </w:rPr>
-        <w:t xml:space="preserve">שקופית 34 – שלושה עקרונות</w:t>
+        <w:t xml:space="preserve">שקופית 33 – שלושה עקרונות</w:t>
       </w:r>
     </w:p>
     <w:p>
@@ -3482,7 +3431,7 @@
           <w:szCs w:val="28"/>
           <w:rtl/>
         </w:rPr>
-        <w:t xml:space="preserve">שקופית 35 – פרק 06</w:t>
+        <w:t xml:space="preserve">שקופית 34 – פרק 06</w:t>
       </w:r>
     </w:p>
     <w:p>
@@ -3549,7 +3498,7 @@
           <w:szCs w:val="28"/>
           <w:rtl/>
         </w:rPr>
-        <w:t xml:space="preserve">שקופית 36 – מה אני עושה עם זה היום</w:t>
+        <w:t xml:space="preserve">שקופית 35 – מה אני עושה עם זה היום</w:t>
       </w:r>
     </w:p>
     <w:p>
@@ -3664,7 +3613,7 @@
           <w:szCs w:val="28"/>
           <w:rtl/>
         </w:rPr>
-        <w:t xml:space="preserve">שקופית 37 – בוחר מה עושים מכאן</w:t>
+        <w:t xml:space="preserve">שקופית 36 – בוחר מה עושים מכאן</w:t>
       </w:r>
     </w:p>
     <w:p>
@@ -3817,7 +3766,7 @@
           <w:szCs w:val="28"/>
           <w:rtl/>
         </w:rPr>
-        <w:t xml:space="preserve">שקופית 38 – ההחלטה</w:t>
+        <w:t xml:space="preserve">שקופית 37 – ההחלטה</w:t>
       </w:r>
     </w:p>
     <w:p>
@@ -3932,7 +3881,7 @@
           <w:szCs w:val="28"/>
           <w:rtl/>
         </w:rPr>
-        <w:t xml:space="preserve">שקופית 39 – תודה</w:t>
+        <w:t xml:space="preserve">שקופית 38 – תודה</w:t>
       </w:r>
     </w:p>
     <w:p>

</xml_diff>

<commit_message>
Move the Shomer HaHadash year to its own slide 8 (39 slides)
Co-Authored-By: Claude Opus 5.5 <noreply@anthropic.com>
Claude-Session: https://claude.ai/code/session_01VJ4ffGR4QBf998EQw4XNfv
</commit_message>
<xml_diff>
--- a/presentation/lecture-script.docx
+++ b/presentation/lecture-script.docx
@@ -773,38 +773,6 @@
     </w:p>
     <w:p>
       <w:pPr>
-        <w:bidi/>
-        <w:spacing w:after="140" w:line="360"/>
-        <w:jc w:val="right"/>
-      </w:pPr>
-      <w:r>
-        <w:rPr>
-          <w:rFonts w:ascii="Arial" w:cs="Arial" w:eastAsia="Arial" w:hAnsi="Arial"/>
-          <w:sz w:val="26"/>
-          <w:szCs w:val="26"/>
-          <w:rtl/>
-        </w:rPr>
-        <w:t xml:space="preserve">בהתחלה החלטתי ללכת לשנת שירות ב"שומר החדש". עבדתי שם בחקלאות, ובזכות זה, דרך גרעין נח״ל, התגייסתי לנח״ל. משם הגעתי לסיירת.</w:t>
-      </w:r>
-    </w:p>
-    <w:p>
-      <w:pPr>
-        <w:bidi/>
-        <w:spacing w:after="140" w:line="360"/>
-        <w:jc w:val="right"/>
-      </w:pPr>
-      <w:r>
-        <w:rPr>
-          <w:rFonts w:ascii="Arial" w:cs="Arial" w:eastAsia="Arial" w:hAnsi="Arial"/>
-          <w:sz w:val="26"/>
-          <w:szCs w:val="26"/>
-          <w:rtl/>
-        </w:rPr>
-        <w:t xml:space="preserve">רציתי להגיע לשם כי אני אוהב אתגרים. ורציתי להוכיח לעצמי שאני באמת תותח כמו שאני מרגיש, בניגוד למה שאמרו לי כל הזמן.</w:t>
-      </w:r>
-    </w:p>
-    <w:p>
-      <w:pPr>
         <w:pStyle w:val="Heading2"/>
         <w:keepNext/>
         <w:bidi/>
@@ -820,7 +788,7 @@
           <w:szCs w:val="28"/>
           <w:rtl/>
         </w:rPr>
-        <w:t xml:space="preserve">שקופית 8 – השירות הצבאי</w:t>
+        <w:t xml:space="preserve">שקופית 8 – שנת שירות ב״שומר החדש״ – גרעין נח״ל</w:t>
       </w:r>
     </w:p>
     <w:p>
@@ -851,55 +819,39 @@
           <w:szCs w:val="20"/>
           <w:rtl/>
         </w:rPr>
-        <w:t xml:space="preserve">ציר זמן: שנת שירות ב״שומר החדש״ – גרעין נח״ל, מסלול בסיירת נח״ל, קו יקיר, אימון חורף, מבצע ״בית וגן״, קו עזה. מתחת שלוש תמונות: מסע האלונקות, אתה עם הסיכה, והצוות בסוף המסלול.</w:t>
-      </w:r>
-    </w:p>
-    <w:p>
-      <w:pPr>
-        <w:bidi/>
-        <w:spacing w:after="140" w:line="360"/>
-        <w:jc w:val="right"/>
-      </w:pPr>
-      <w:r>
-        <w:rPr>
-          <w:rFonts w:ascii="Arial" w:cs="Arial" w:eastAsia="Arial" w:hAnsi="Arial"/>
-          <w:sz w:val="26"/>
-          <w:szCs w:val="26"/>
-          <w:rtl/>
-        </w:rPr>
-        <w:t xml:space="preserve">אחרי שסיימתי מסלול, עלינו לקו יקיר לארבעה חודשים. אני הגעתי לחודשיים האחרונים. מיד אחר כך אימון חורף, ובתוכו גם מבצע "בית וגן" בג׳נין, מי שזוכר. ומיד אחר כך עלינו לקו עזה.</w:t>
-      </w:r>
-    </w:p>
-    <w:p>
-      <w:pPr>
-        <w:bidi/>
-        <w:spacing w:after="140" w:line="360"/>
-        <w:jc w:val="right"/>
-      </w:pPr>
-      <w:r>
-        <w:rPr>
-          <w:rFonts w:ascii="Arial" w:cs="Arial" w:eastAsia="Arial" w:hAnsi="Arial"/>
-          <w:sz w:val="26"/>
-          <w:szCs w:val="26"/>
-          <w:rtl/>
-        </w:rPr>
-        <w:t xml:space="preserve">המחיר היה קושי פיזי ומנטלי, יחד עם כל מיני קשיים בבית. והצבא לימד אותי שהכול בראש, ושתמיד אפשר להשתפר.</w:t>
-      </w:r>
-    </w:p>
-    <w:p>
-      <w:pPr>
-        <w:bidi/>
-        <w:spacing w:after="140" w:line="360"/>
-        <w:jc w:val="right"/>
-      </w:pPr>
-      <w:r>
-        <w:rPr>
-          <w:rFonts w:ascii="Arial" w:cs="Arial" w:eastAsia="Arial" w:hAnsi="Arial"/>
-          <w:sz w:val="26"/>
-          <w:szCs w:val="26"/>
-          <w:rtl/>
-        </w:rPr>
-        <w:t xml:space="preserve">מוטיבציה מביאה אותך להתחלה. משמעת מביאה אותך לסוף.</w:t>
+        <w:t xml:space="preserve">הכותרת, ומתחתיה תמונות מהשנה בשומר החדש (יתווספו).</w:t>
+      </w:r>
+    </w:p>
+    <w:p>
+      <w:pPr>
+        <w:bidi/>
+        <w:spacing w:after="140" w:line="360"/>
+        <w:jc w:val="right"/>
+      </w:pPr>
+      <w:r>
+        <w:rPr>
+          <w:rFonts w:ascii="Arial" w:cs="Arial" w:eastAsia="Arial" w:hAnsi="Arial"/>
+          <w:sz w:val="26"/>
+          <w:szCs w:val="26"/>
+          <w:rtl/>
+        </w:rPr>
+        <w:t xml:space="preserve">בהתחלה החלטתי ללכת לשנת שירות ב"שומר החדש". עבדתי שם בחקלאות, ובזכות זה, דרך גרעין נח״ל, התגייסתי לנח״ל. משם הגעתי לסיירת.</w:t>
+      </w:r>
+    </w:p>
+    <w:p>
+      <w:pPr>
+        <w:bidi/>
+        <w:spacing w:after="140" w:line="360"/>
+        <w:jc w:val="right"/>
+      </w:pPr>
+      <w:r>
+        <w:rPr>
+          <w:rFonts w:ascii="Arial" w:cs="Arial" w:eastAsia="Arial" w:hAnsi="Arial"/>
+          <w:sz w:val="26"/>
+          <w:szCs w:val="26"/>
+          <w:rtl/>
+        </w:rPr>
+        <w:t xml:space="preserve">רציתי להגיע לשם כי אני אוהב אתגרים. ורציתי להוכיח לעצמי שאני באמת תותח כמו שאני מרגיש, בניגוד למה שאמרו לי כל הזמן.</w:t>
       </w:r>
     </w:p>
     <w:p>
@@ -919,7 +871,106 @@
           <w:szCs w:val="28"/>
           <w:rtl/>
         </w:rPr>
-        <w:t xml:space="preserve">שקופית 9 – שני מפקדים. שני שיעורים</w:t>
+        <w:t xml:space="preserve">שקופית 9 – השירות הצבאי</w:t>
+      </w:r>
+    </w:p>
+    <w:p>
+      <w:pPr>
+        <w:keepNext/>
+        <w:shd w:fill="F4F1EC" w:color="auto" w:val="clear"/>
+        <w:bidi/>
+        <w:spacing w:after="140"/>
+        <w:jc w:val="right"/>
+      </w:pPr>
+      <w:r>
+        <w:rPr>
+          <w:rFonts w:ascii="Arial" w:cs="Arial" w:eastAsia="Arial" w:hAnsi="Arial"/>
+          <w:b/>
+          <w:bCs/>
+          <w:color w:val="8A8F99"/>
+          <w:sz w:val="20"/>
+          <w:szCs w:val="20"/>
+          <w:rtl/>
+        </w:rPr>
+        <w:t xml:space="preserve">על המסך: </w:t>
+      </w:r>
+      <w:r>
+        <w:rPr>
+          <w:rFonts w:ascii="Arial" w:cs="Arial" w:eastAsia="Arial" w:hAnsi="Arial"/>
+          <w:color w:val="8A8F99"/>
+          <w:sz w:val="20"/>
+          <w:szCs w:val="20"/>
+          <w:rtl/>
+        </w:rPr>
+        <w:t xml:space="preserve">ציר זמן: מסלול בסיירת נח״ל, קו יקיר, אימון חורף, מבצע ״בית וגן״, קו עזה. מתחת שלוש תמונות: מסע האלונקות, אתה עם הסיכה, והצוות בסוף המסלול.</w:t>
+      </w:r>
+    </w:p>
+    <w:p>
+      <w:pPr>
+        <w:bidi/>
+        <w:spacing w:after="140" w:line="360"/>
+        <w:jc w:val="right"/>
+      </w:pPr>
+      <w:r>
+        <w:rPr>
+          <w:rFonts w:ascii="Arial" w:cs="Arial" w:eastAsia="Arial" w:hAnsi="Arial"/>
+          <w:sz w:val="26"/>
+          <w:szCs w:val="26"/>
+          <w:rtl/>
+        </w:rPr>
+        <w:t xml:space="preserve">אחרי שסיימתי מסלול, עלינו לקו יקיר לארבעה חודשים. אני הגעתי לחודשיים האחרונים. מיד אחר כך אימון חורף, ובתוכו גם מבצע "בית וגן" בג׳נין, מי שזוכר. ומיד אחר כך עלינו לקו עזה.</w:t>
+      </w:r>
+    </w:p>
+    <w:p>
+      <w:pPr>
+        <w:bidi/>
+        <w:spacing w:after="140" w:line="360"/>
+        <w:jc w:val="right"/>
+      </w:pPr>
+      <w:r>
+        <w:rPr>
+          <w:rFonts w:ascii="Arial" w:cs="Arial" w:eastAsia="Arial" w:hAnsi="Arial"/>
+          <w:sz w:val="26"/>
+          <w:szCs w:val="26"/>
+          <w:rtl/>
+        </w:rPr>
+        <w:t xml:space="preserve">המחיר היה קושי פיזי ומנטלי, יחד עם כל מיני קשיים בבית. והצבא לימד אותי שהכול בראש, ושתמיד אפשר להשתפר.</w:t>
+      </w:r>
+    </w:p>
+    <w:p>
+      <w:pPr>
+        <w:bidi/>
+        <w:spacing w:after="140" w:line="360"/>
+        <w:jc w:val="right"/>
+      </w:pPr>
+      <w:r>
+        <w:rPr>
+          <w:rFonts w:ascii="Arial" w:cs="Arial" w:eastAsia="Arial" w:hAnsi="Arial"/>
+          <w:sz w:val="26"/>
+          <w:szCs w:val="26"/>
+          <w:rtl/>
+        </w:rPr>
+        <w:t xml:space="preserve">מוטיבציה מביאה אותך להתחלה. משמעת מביאה אותך לסוף.</w:t>
+      </w:r>
+    </w:p>
+    <w:p>
+      <w:pPr>
+        <w:pStyle w:val="Heading2"/>
+        <w:keepNext/>
+        <w:bidi/>
+        <w:spacing w:after="80" w:before="320"/>
+        <w:jc w:val="right"/>
+      </w:pPr>
+      <w:r>
+        <w:rPr>
+          <w:rFonts w:ascii="Arial" w:cs="Arial" w:eastAsia="Arial" w:hAnsi="Arial"/>
+          <w:b/>
+          <w:bCs/>
+          <w:sz w:val="28"/>
+          <w:szCs w:val="28"/>
+          <w:rtl/>
+        </w:rPr>
+        <w:t xml:space="preserve">שקופית 10 – שני מפקדים. שני שיעורים</w:t>
       </w:r>
     </w:p>
     <w:p>
@@ -1095,7 +1146,7 @@
           <w:szCs w:val="28"/>
           <w:rtl/>
         </w:rPr>
-        <w:t xml:space="preserve">שקופית 10 – פרק 03</w:t>
+        <w:t xml:space="preserve">שקופית 11 – פרק 03</w:t>
       </w:r>
     </w:p>
     <w:p>
@@ -1162,7 +1213,7 @@
           <w:szCs w:val="28"/>
           <w:rtl/>
         </w:rPr>
-        <w:t xml:space="preserve">שקופית 11 – הגזרה הדרומית</w:t>
+        <w:t xml:space="preserve">שקופית 12 – הגזרה הדרומית</w:t>
       </w:r>
     </w:p>
     <w:p>
@@ -1229,7 +1280,7 @@
           <w:szCs w:val="28"/>
           <w:rtl/>
         </w:rPr>
-        <w:t xml:space="preserve">שקופית 12 – איך זה עבד בגזרה</w:t>
+        <w:t xml:space="preserve">שקופית 13 – איך זה עבד בגזרה</w:t>
       </w:r>
     </w:p>
     <w:p>
@@ -1312,7 +1363,7 @@
           <w:szCs w:val="28"/>
           <w:rtl/>
         </w:rPr>
-        <w:t xml:space="preserve">שקופית 13 – מה זה נגמ״ש?</w:t>
+        <w:t xml:space="preserve">שקופית 14 – מה זה נגמ״ש?</w:t>
       </w:r>
     </w:p>
     <w:p>
@@ -1379,7 +1430,7 @@
           <w:szCs w:val="28"/>
           <w:rtl/>
         </w:rPr>
-        <w:t xml:space="preserve">שקופית 14 – עליתי למשמרת</w:t>
+        <w:t xml:space="preserve">שקופית 15 – עליתי למשמרת</w:t>
       </w:r>
     </w:p>
     <w:p>
@@ -1462,7 +1513,7 @@
           <w:szCs w:val="28"/>
           <w:rtl/>
         </w:rPr>
-        <w:t xml:space="preserve">שקופית 15 – 06:29</w:t>
+        <w:t xml:space="preserve">שקופית 16 – 06:29</w:t>
       </w:r>
     </w:p>
     <w:p>
@@ -1548,7 +1599,7 @@
           <w:szCs w:val="28"/>
           <w:rtl/>
         </w:rPr>
-        <w:t xml:space="preserve">שקופית 16 – הקלטת קשר: הסמג״ד מכריז על מלחמה</w:t>
+        <w:t xml:space="preserve">שקופית 17 – הקלטת קשר: הסמג״ד מכריז על מלחמה</w:t>
       </w:r>
     </w:p>
     <w:p>
@@ -1634,7 +1685,7 @@
           <w:szCs w:val="28"/>
           <w:rtl/>
         </w:rPr>
-        <w:t xml:space="preserve">שקופית 17 – מהצד השני של הכביש</w:t>
+        <w:t xml:space="preserve">שקופית 18 – מהצד השני של הכביש</w:t>
       </w:r>
     </w:p>
     <w:p>
@@ -1720,7 +1771,7 @@
           <w:szCs w:val="28"/>
           <w:rtl/>
         </w:rPr>
-        <w:t xml:space="preserve">שקופית 18 – מפת הקרב</w:t>
+        <w:t xml:space="preserve">שקופית 19 – מפת הקרב</w:t>
       </w:r>
     </w:p>
     <w:p>
@@ -1787,7 +1838,7 @@
           <w:szCs w:val="28"/>
           <w:rtl/>
         </w:rPr>
-        <w:t xml:space="preserve">שקופית 19 – בינתיים, בתוך המוצב</w:t>
+        <w:t xml:space="preserve">שקופית 20 – בינתיים, בתוך המוצב</w:t>
       </w:r>
     </w:p>
     <w:p>
@@ -1873,7 +1924,7 @@
           <w:szCs w:val="28"/>
           <w:rtl/>
         </w:rPr>
-        <w:t xml:space="preserve">שקופית 20 – באותו רגע שנפצעתי</w:t>
+        <w:t xml:space="preserve">שקופית 21 – באותו רגע שנפצעתי</w:t>
       </w:r>
     </w:p>
     <w:p>
@@ -2087,7 +2138,7 @@
           <w:szCs w:val="28"/>
           <w:rtl/>
         </w:rPr>
-        <w:t xml:space="preserve">שקופית 21 – הקלטת קשר: הסמל מבקש פינוי</w:t>
+        <w:t xml:space="preserve">שקופית 22 – הקלטת קשר: הסמל מבקש פינוי</w:t>
       </w:r>
     </w:p>
     <w:p>
@@ -2189,7 +2240,7 @@
           <w:szCs w:val="28"/>
           <w:rtl/>
         </w:rPr>
-        <w:t xml:space="preserve">שקופית 22 – הנגמ״ש שלנו</w:t>
+        <w:t xml:space="preserve">שקופית 23 – הנגמ״ש שלנו</w:t>
       </w:r>
     </w:p>
     <w:p>
@@ -2256,7 +2307,7 @@
           <w:szCs w:val="28"/>
           <w:rtl/>
         </w:rPr>
-        <w:t xml:space="preserve">שקופית 23 – הקלטת קשר: כולם מבקשים פינוי</w:t>
+        <w:t xml:space="preserve">שקופית 24 – הקלטת קשר: כולם מבקשים פינוי</w:t>
       </w:r>
     </w:p>
     <w:p>
@@ -2358,7 +2409,7 @@
           <w:szCs w:val="28"/>
           <w:rtl/>
         </w:rPr>
-        <w:t xml:space="preserve">שקופית 24 – הקלטת קשר: קליין נותן פקודה</w:t>
+        <w:t xml:space="preserve">שקופית 25 – הקלטת קשר: קליין נותן פקודה</w:t>
       </w:r>
     </w:p>
     <w:p>
@@ -2444,7 +2495,7 @@
           <w:szCs w:val="28"/>
           <w:rtl/>
         </w:rPr>
-        <w:t xml:space="preserve">שקופית 25 – הפינוי</w:t>
+        <w:t xml:space="preserve">שקופית 26 – הפינוי</w:t>
       </w:r>
     </w:p>
     <w:p>
@@ -2511,7 +2562,7 @@
           <w:szCs w:val="28"/>
           <w:rtl/>
         </w:rPr>
-        <w:t xml:space="preserve">שקופית 26 – ההודעה הקולית מסורוקה</w:t>
+        <w:t xml:space="preserve">שקופית 27 – ההודעה הקולית מסורוקה</w:t>
       </w:r>
     </w:p>
     <w:p>
@@ -2613,7 +2664,7 @@
           <w:szCs w:val="28"/>
           <w:rtl/>
         </w:rPr>
-        <w:t xml:space="preserve">שקופית 27 – האמת?</w:t>
+        <w:t xml:space="preserve">שקופית 28 – האמת?</w:t>
       </w:r>
     </w:p>
     <w:p>
@@ -2744,7 +2795,7 @@
           <w:szCs w:val="28"/>
           <w:rtl/>
         </w:rPr>
-        <w:t xml:space="preserve">שקופית 28 – פרק 04</w:t>
+        <w:t xml:space="preserve">שקופית 29 – פרק 04</w:t>
       </w:r>
     </w:p>
     <w:p>
@@ -2811,7 +2862,7 @@
           <w:szCs w:val="28"/>
           <w:rtl/>
         </w:rPr>
-        <w:t xml:space="preserve">שקופית 29 – הדבר הכי קשה לא היה הפציעה</w:t>
+        <w:t xml:space="preserve">שקופית 30 – הדבר הכי קשה לא היה הפציעה</w:t>
       </w:r>
     </w:p>
     <w:p>
@@ -2945,7 +2996,7 @@
           <w:szCs w:val="28"/>
           <w:rtl/>
         </w:rPr>
-        <w:t xml:space="preserve">שקופית 30 – מה שאף אחד לא מכין אותך אליו</w:t>
+        <w:t xml:space="preserve">שקופית 31 – מה שאף אחד לא מכין אותך אליו</w:t>
       </w:r>
     </w:p>
     <w:p>
@@ -3076,7 +3127,7 @@
           <w:szCs w:val="28"/>
           <w:rtl/>
         </w:rPr>
-        <w:t xml:space="preserve">שקופית 31 – מאז</w:t>
+        <w:t xml:space="preserve">שקופית 32 – מאז</w:t>
       </w:r>
     </w:p>
     <w:p>
@@ -3172,7 +3223,7 @@
           <w:szCs w:val="28"/>
           <w:rtl/>
         </w:rPr>
-        <w:t xml:space="preserve">שקופית 32 – פרק 05</w:t>
+        <w:t xml:space="preserve">שקופית 33 – פרק 05</w:t>
       </w:r>
     </w:p>
     <w:p>
@@ -3239,7 +3290,7 @@
           <w:szCs w:val="28"/>
           <w:rtl/>
         </w:rPr>
-        <w:t xml:space="preserve">שקופית 33 – שלושה עקרונות</w:t>
+        <w:t xml:space="preserve">שקופית 34 – שלושה עקרונות</w:t>
       </w:r>
     </w:p>
     <w:p>
@@ -3431,7 +3482,7 @@
           <w:szCs w:val="28"/>
           <w:rtl/>
         </w:rPr>
-        <w:t xml:space="preserve">שקופית 34 – פרק 06</w:t>
+        <w:t xml:space="preserve">שקופית 35 – פרק 06</w:t>
       </w:r>
     </w:p>
     <w:p>
@@ -3498,7 +3549,7 @@
           <w:szCs w:val="28"/>
           <w:rtl/>
         </w:rPr>
-        <w:t xml:space="preserve">שקופית 35 – מה אני עושה עם זה היום</w:t>
+        <w:t xml:space="preserve">שקופית 36 – מה אני עושה עם זה היום</w:t>
       </w:r>
     </w:p>
     <w:p>
@@ -3613,7 +3664,7 @@
           <w:szCs w:val="28"/>
           <w:rtl/>
         </w:rPr>
-        <w:t xml:space="preserve">שקופית 36 – בוחר מה עושים מכאן</w:t>
+        <w:t xml:space="preserve">שקופית 37 – בוחר מה עושים מכאן</w:t>
       </w:r>
     </w:p>
     <w:p>
@@ -3766,7 +3817,7 @@
           <w:szCs w:val="28"/>
           <w:rtl/>
         </w:rPr>
-        <w:t xml:space="preserve">שקופית 37 – ההחלטה</w:t>
+        <w:t xml:space="preserve">שקופית 38 – ההחלטה</w:t>
       </w:r>
     </w:p>
     <w:p>
@@ -3881,7 +3932,7 @@
           <w:szCs w:val="28"/>
           <w:rtl/>
         </w:rPr>
-        <w:t xml:space="preserve">שקופית 38 – תודה</w:t>
+        <w:t xml:space="preserve">שקופית 39 – תודה</w:t>
       </w:r>
     </w:p>
     <w:p>

</xml_diff>

<commit_message>
One slide per crisis principle, clearer overview title, battle map before the Nukhba video (42 slides)
Co-Authored-By: Claude Opus 5.5 <noreply@anthropic.com>
Claude-Session: https://claude.ai/code/session_01VJ4ffGR4QBf998EQw4XNfv
</commit_message>
<xml_diff>
--- a/presentation/lecture-script.docx
+++ b/presentation/lecture-script.docx
@@ -1685,7 +1685,74 @@
           <w:szCs w:val="28"/>
           <w:rtl/>
         </w:rPr>
-        <w:t xml:space="preserve">שקופית 18 – מהצד השני של הכביש</w:t>
+        <w:t xml:space="preserve">שקופית 18 – מפת הקרב</w:t>
+      </w:r>
+    </w:p>
+    <w:p>
+      <w:pPr>
+        <w:keepNext/>
+        <w:shd w:fill="F4F1EC" w:color="auto" w:val="clear"/>
+        <w:bidi/>
+        <w:spacing w:after="140"/>
+        <w:jc w:val="right"/>
+      </w:pPr>
+      <w:r>
+        <w:rPr>
+          <w:rFonts w:ascii="Arial" w:cs="Arial" w:eastAsia="Arial" w:hAnsi="Arial"/>
+          <w:b/>
+          <w:bCs/>
+          <w:color w:val="8A8F99"/>
+          <w:sz w:val="20"/>
+          <w:szCs w:val="20"/>
+          <w:rtl/>
+        </w:rPr>
+        <w:t xml:space="preserve">על המסך: </w:t>
+      </w:r>
+      <w:r>
+        <w:rPr>
+          <w:rFonts w:ascii="Arial" w:cs="Arial" w:eastAsia="Arial" w:hAnsi="Arial"/>
+          <w:color w:val="8A8F99"/>
+          <w:sz w:val="20"/>
+          <w:szCs w:val="20"/>
+          <w:rtl/>
+        </w:rPr>
+        <w:t xml:space="preserve">מפת הקרב בצילום אוויר, עם התוויות: מוצב סופה, קיבוץ סופה, המחבלים, הנגמ״ש, אנדרטת דנגור.</w:t>
+      </w:r>
+    </w:p>
+    <w:p>
+      <w:pPr>
+        <w:bidi/>
+        <w:spacing w:after="140" w:line="360"/>
+        <w:jc w:val="right"/>
+      </w:pPr>
+      <w:r>
+        <w:rPr>
+          <w:rFonts w:ascii="Arial" w:cs="Arial" w:eastAsia="Arial" w:hAnsi="Arial"/>
+          <w:sz w:val="26"/>
+          <w:szCs w:val="26"/>
+          <w:rtl/>
+        </w:rPr>
+        <w:t xml:space="preserve">רגע לפני שאני ממשיך, תסתכלו על המפה. כאן המוצב, כאן הקיבוץ, מכאן הגיעו המחבלים, וכאן הנגמ״ש.</w:t>
+      </w:r>
+    </w:p>
+    <w:p>
+      <w:pPr>
+        <w:pStyle w:val="Heading2"/>
+        <w:keepNext/>
+        <w:bidi/>
+        <w:spacing w:after="80" w:before="320"/>
+        <w:jc w:val="right"/>
+      </w:pPr>
+      <w:r>
+        <w:rPr>
+          <w:rFonts w:ascii="Arial" w:cs="Arial" w:eastAsia="Arial" w:hAnsi="Arial"/>
+          <w:b/>
+          <w:bCs/>
+          <w:sz w:val="28"/>
+          <w:szCs w:val="28"/>
+          <w:rtl/>
+        </w:rPr>
+        <w:t xml:space="preserve">שקופית 19 – מהצד השני של הכביש</w:t>
       </w:r>
     </w:p>
     <w:p>
@@ -1752,73 +1819,6 @@
           <w:rtl/>
         </w:rPr>
         <w:t xml:space="preserve">(לחיצה – סרטון המחבלים. לא לדבר מעליו)</w:t>
-      </w:r>
-    </w:p>
-    <w:p>
-      <w:pPr>
-        <w:pStyle w:val="Heading2"/>
-        <w:keepNext/>
-        <w:bidi/>
-        <w:spacing w:after="80" w:before="320"/>
-        <w:jc w:val="right"/>
-      </w:pPr>
-      <w:r>
-        <w:rPr>
-          <w:rFonts w:ascii="Arial" w:cs="Arial" w:eastAsia="Arial" w:hAnsi="Arial"/>
-          <w:b/>
-          <w:bCs/>
-          <w:sz w:val="28"/>
-          <w:szCs w:val="28"/>
-          <w:rtl/>
-        </w:rPr>
-        <w:t xml:space="preserve">שקופית 19 – מפת הקרב</w:t>
-      </w:r>
-    </w:p>
-    <w:p>
-      <w:pPr>
-        <w:keepNext/>
-        <w:shd w:fill="F4F1EC" w:color="auto" w:val="clear"/>
-        <w:bidi/>
-        <w:spacing w:after="140"/>
-        <w:jc w:val="right"/>
-      </w:pPr>
-      <w:r>
-        <w:rPr>
-          <w:rFonts w:ascii="Arial" w:cs="Arial" w:eastAsia="Arial" w:hAnsi="Arial"/>
-          <w:b/>
-          <w:bCs/>
-          <w:color w:val="8A8F99"/>
-          <w:sz w:val="20"/>
-          <w:szCs w:val="20"/>
-          <w:rtl/>
-        </w:rPr>
-        <w:t xml:space="preserve">על המסך: </w:t>
-      </w:r>
-      <w:r>
-        <w:rPr>
-          <w:rFonts w:ascii="Arial" w:cs="Arial" w:eastAsia="Arial" w:hAnsi="Arial"/>
-          <w:color w:val="8A8F99"/>
-          <w:sz w:val="20"/>
-          <w:szCs w:val="20"/>
-          <w:rtl/>
-        </w:rPr>
-        <w:t xml:space="preserve">מפת הקרב בצילום אוויר, עם התוויות: מוצב סופה, קיבוץ סופה, המחבלים, הנגמ״ש, אנדרטת דנגור.</w:t>
-      </w:r>
-    </w:p>
-    <w:p>
-      <w:pPr>
-        <w:bidi/>
-        <w:spacing w:after="140" w:line="360"/>
-        <w:jc w:val="right"/>
-      </w:pPr>
-      <w:r>
-        <w:rPr>
-          <w:rFonts w:ascii="Arial" w:cs="Arial" w:eastAsia="Arial" w:hAnsi="Arial"/>
-          <w:sz w:val="26"/>
-          <w:szCs w:val="26"/>
-          <w:rtl/>
-        </w:rPr>
-        <w:t xml:space="preserve">זה מה שהם ראו. כאן המוצב, כאן הקיבוץ, מכאן הגיעו המחבלים, וכאן הנגמ״ש שעליו הם ירו.</w:t>
       </w:r>
     </w:p>
     <w:p>
@@ -3290,7 +3290,7 @@
           <w:szCs w:val="28"/>
           <w:rtl/>
         </w:rPr>
-        <w:t xml:space="preserve">שקופית 34 – שלושה עקרונות</w:t>
+        <w:t xml:space="preserve">שקופית 34 – שלושה עקרונות לעבור משבר</w:t>
       </w:r>
     </w:p>
     <w:p>
@@ -3342,6 +3342,57 @@
     </w:p>
     <w:p>
       <w:pPr>
+        <w:pStyle w:val="Heading2"/>
+        <w:keepNext/>
+        <w:bidi/>
+        <w:spacing w:after="80" w:before="320"/>
+        <w:jc w:val="right"/>
+      </w:pPr>
+      <w:r>
+        <w:rPr>
+          <w:rFonts w:ascii="Arial" w:cs="Arial" w:eastAsia="Arial" w:hAnsi="Arial"/>
+          <w:b/>
+          <w:bCs/>
+          <w:sz w:val="28"/>
+          <w:szCs w:val="28"/>
+          <w:rtl/>
+        </w:rPr>
+        <w:t xml:space="preserve">שקופית 35 – עיקרון 1</w:t>
+      </w:r>
+    </w:p>
+    <w:p>
+      <w:pPr>
+        <w:keepNext/>
+        <w:shd w:fill="F4F1EC" w:color="auto" w:val="clear"/>
+        <w:bidi/>
+        <w:spacing w:after="140"/>
+        <w:jc w:val="right"/>
+      </w:pPr>
+      <w:r>
+        <w:rPr>
+          <w:rFonts w:ascii="Arial" w:cs="Arial" w:eastAsia="Arial" w:hAnsi="Arial"/>
+          <w:b/>
+          <w:bCs/>
+          <w:color w:val="8A8F99"/>
+          <w:sz w:val="20"/>
+          <w:szCs w:val="20"/>
+          <w:rtl/>
+        </w:rPr>
+        <w:t xml:space="preserve">על המסך: </w:t>
+      </w:r>
+      <w:r>
+        <w:rPr>
+          <w:rFonts w:ascii="Arial" w:cs="Arial" w:eastAsia="Arial" w:hAnsi="Arial"/>
+          <w:color w:val="8A8F99"/>
+          <w:sz w:val="20"/>
+          <w:szCs w:val="20"/>
+          <w:rtl/>
+        </w:rPr>
+        <w:t xml:space="preserve">עיקרון 1 מתוך 3: אתה לא שולט במה שקורה לך. בלחיצה: אבל אתה כן שולט במה שאתה עושה עם זה.</w:t>
+      </w:r>
+    </w:p>
+    <w:p>
+      <w:pPr>
         <w:bidi/>
         <w:spacing w:after="140" w:line="360"/>
         <w:jc w:val="right"/>
@@ -3374,6 +3425,57 @@
     </w:p>
     <w:p>
       <w:pPr>
+        <w:pStyle w:val="Heading2"/>
+        <w:keepNext/>
+        <w:bidi/>
+        <w:spacing w:after="80" w:before="320"/>
+        <w:jc w:val="right"/>
+      </w:pPr>
+      <w:r>
+        <w:rPr>
+          <w:rFonts w:ascii="Arial" w:cs="Arial" w:eastAsia="Arial" w:hAnsi="Arial"/>
+          <w:b/>
+          <w:bCs/>
+          <w:sz w:val="28"/>
+          <w:szCs w:val="28"/>
+          <w:rtl/>
+        </w:rPr>
+        <w:t xml:space="preserve">שקופית 36 – עיקרון 2</w:t>
+      </w:r>
+    </w:p>
+    <w:p>
+      <w:pPr>
+        <w:keepNext/>
+        <w:shd w:fill="F4F1EC" w:color="auto" w:val="clear"/>
+        <w:bidi/>
+        <w:spacing w:after="140"/>
+        <w:jc w:val="right"/>
+      </w:pPr>
+      <w:r>
+        <w:rPr>
+          <w:rFonts w:ascii="Arial" w:cs="Arial" w:eastAsia="Arial" w:hAnsi="Arial"/>
+          <w:b/>
+          <w:bCs/>
+          <w:color w:val="8A8F99"/>
+          <w:sz w:val="20"/>
+          <w:szCs w:val="20"/>
+          <w:rtl/>
+        </w:rPr>
+        <w:t xml:space="preserve">על המסך: </w:t>
+      </w:r>
+      <w:r>
+        <w:rPr>
+          <w:rFonts w:ascii="Arial" w:cs="Arial" w:eastAsia="Arial" w:hAnsi="Arial"/>
+          <w:color w:val="8A8F99"/>
+          <w:sz w:val="20"/>
+          <w:szCs w:val="20"/>
+          <w:rtl/>
+        </w:rPr>
+        <w:t xml:space="preserve">עיקרון 2 מתוך 3: לא חייבים לדעת את כל הדרך. בלחיצה: צריך לדעת רק מה הצעד הבא.</w:t>
+      </w:r>
+    </w:p>
+    <w:p>
+      <w:pPr>
         <w:bidi/>
         <w:spacing w:after="140" w:line="360"/>
         <w:jc w:val="right"/>
@@ -3402,6 +3504,57 @@
           <w:rtl/>
         </w:rPr>
         <w:t xml:space="preserve">אחרי השיקום לא היה לי מושג מה אני עושה עם החיים שלי. הצעד הראשון היה רק לנסוע לפנמה. משם הגיע הצעד הבא, ואחריו עוד אחד. היום אני לומד, עובד ומרצה.</w:t>
+      </w:r>
+    </w:p>
+    <w:p>
+      <w:pPr>
+        <w:pStyle w:val="Heading2"/>
+        <w:keepNext/>
+        <w:bidi/>
+        <w:spacing w:after="80" w:before="320"/>
+        <w:jc w:val="right"/>
+      </w:pPr>
+      <w:r>
+        <w:rPr>
+          <w:rFonts w:ascii="Arial" w:cs="Arial" w:eastAsia="Arial" w:hAnsi="Arial"/>
+          <w:b/>
+          <w:bCs/>
+          <w:sz w:val="28"/>
+          <w:szCs w:val="28"/>
+          <w:rtl/>
+        </w:rPr>
+        <w:t xml:space="preserve">שקופית 37 – עיקרון 3</w:t>
+      </w:r>
+    </w:p>
+    <w:p>
+      <w:pPr>
+        <w:keepNext/>
+        <w:shd w:fill="F4F1EC" w:color="auto" w:val="clear"/>
+        <w:bidi/>
+        <w:spacing w:after="140"/>
+        <w:jc w:val="right"/>
+      </w:pPr>
+      <w:r>
+        <w:rPr>
+          <w:rFonts w:ascii="Arial" w:cs="Arial" w:eastAsia="Arial" w:hAnsi="Arial"/>
+          <w:b/>
+          <w:bCs/>
+          <w:color w:val="8A8F99"/>
+          <w:sz w:val="20"/>
+          <w:szCs w:val="20"/>
+          <w:rtl/>
+        </w:rPr>
+        <w:t xml:space="preserve">על המסך: </w:t>
+      </w:r>
+      <w:r>
+        <w:rPr>
+          <w:rFonts w:ascii="Arial" w:cs="Arial" w:eastAsia="Arial" w:hAnsi="Arial"/>
+          <w:color w:val="8A8F99"/>
+          <w:sz w:val="20"/>
+          <w:szCs w:val="20"/>
+          <w:rtl/>
+        </w:rPr>
+        <w:t xml:space="preserve">עיקרון 3 מתוך 3: זהות לא מקבלים. בלחיצה, גדול: בונים.</w:t>
       </w:r>
     </w:p>
     <w:p>
@@ -3482,7 +3635,7 @@
           <w:szCs w:val="28"/>
           <w:rtl/>
         </w:rPr>
-        <w:t xml:space="preserve">שקופית 35 – פרק 06</w:t>
+        <w:t xml:space="preserve">שקופית 38 – פרק 06</w:t>
       </w:r>
     </w:p>
     <w:p>
@@ -3549,7 +3702,7 @@
           <w:szCs w:val="28"/>
           <w:rtl/>
         </w:rPr>
-        <w:t xml:space="preserve">שקופית 36 – מה אני עושה עם זה היום</w:t>
+        <w:t xml:space="preserve">שקופית 39 – מה אני עושה עם זה היום</w:t>
       </w:r>
     </w:p>
     <w:p>
@@ -3664,7 +3817,7 @@
           <w:szCs w:val="28"/>
           <w:rtl/>
         </w:rPr>
-        <w:t xml:space="preserve">שקופית 37 – בוחר מה עושים מכאן</w:t>
+        <w:t xml:space="preserve">שקופית 40 – בוחר מה עושים מכאן</w:t>
       </w:r>
     </w:p>
     <w:p>
@@ -3817,7 +3970,7 @@
           <w:szCs w:val="28"/>
           <w:rtl/>
         </w:rPr>
-        <w:t xml:space="preserve">שקופית 38 – ההחלטה</w:t>
+        <w:t xml:space="preserve">שקופית 41 – ההחלטה</w:t>
       </w:r>
     </w:p>
     <w:p>
@@ -3932,7 +4085,7 @@
           <w:szCs w:val="28"/>
           <w:rtl/>
         </w:rPr>
-        <w:t xml:space="preserve">שקופית 39 – תודה</w:t>
+        <w:t xml:space="preserve">שקופית 42 – תודה</w:t>
       </w:r>
     </w:p>
     <w:p>

</xml_diff>

<commit_message>
Related icons on the 'what no one prepares you for' slide; follow the live slide order (43 slides, second battle-map slide)
Co-Authored-By: Claude Opus 5.5 <noreply@anthropic.com>
Claude-Session: https://claude.ai/code/session_01VJ4ffGR4QBf998EQw4XNfv
</commit_message>
<xml_diff>
--- a/presentation/lecture-script.docx
+++ b/presentation/lecture-script.docx
@@ -1838,7 +1838,7 @@
           <w:szCs w:val="28"/>
           <w:rtl/>
         </w:rPr>
-        <w:t xml:space="preserve">שקופית 20 – בינתיים, בתוך המוצב</w:t>
+        <w:t xml:space="preserve">שקופית 20 – הנגמ״ש שלנו</w:t>
       </w:r>
     </w:p>
     <w:p>
@@ -1869,23 +1869,90 @@
           <w:szCs w:val="20"/>
           <w:rtl/>
         </w:rPr>
-        <w:t xml:space="preserve">סרטון אנכי מתוך מוצב סופה, והכותרת: בינתיים, בתוך המוצב.</w:t>
-      </w:r>
-    </w:p>
-    <w:p>
-      <w:pPr>
-        <w:bidi/>
-        <w:spacing w:after="140" w:line="360"/>
-        <w:jc w:val="right"/>
-      </w:pPr>
-      <w:r>
-        <w:rPr>
-          <w:rFonts w:ascii="Arial" w:cs="Arial" w:eastAsia="Arial" w:hAnsi="Arial"/>
-          <w:sz w:val="26"/>
-          <w:szCs w:val="26"/>
-          <w:rtl/>
-        </w:rPr>
-        <w:t xml:space="preserve">אני לא הייתי שם. זה סרטון מתוך המוצב.</w:t>
+        <w:t xml:space="preserve">תמונה גדולה של הנגמ״ש ההרוס יום אחרי הקרב. מתחת: הנגמ״ש שלנו, מצולם מהמקום שבו עמדו המחבלים.</w:t>
+      </w:r>
+    </w:p>
+    <w:p>
+      <w:pPr>
+        <w:bidi/>
+        <w:spacing w:after="140" w:line="360"/>
+        <w:jc w:val="right"/>
+      </w:pPr>
+      <w:r>
+        <w:rPr>
+          <w:rFonts w:ascii="Arial" w:cs="Arial" w:eastAsia="Arial" w:hAnsi="Arial"/>
+          <w:sz w:val="26"/>
+          <w:szCs w:val="26"/>
+          <w:rtl/>
+        </w:rPr>
+        <w:t xml:space="preserve">זה הנגמ״ש שלנו, יום אחרי הקרב. התמונה צולמה מהמקום שבו עמדו המחבלים. ככה זה נראה מהצד שלהם.</w:t>
+      </w:r>
+    </w:p>
+    <w:p>
+      <w:pPr>
+        <w:pStyle w:val="Heading2"/>
+        <w:keepNext/>
+        <w:bidi/>
+        <w:spacing w:after="80" w:before="320"/>
+        <w:jc w:val="right"/>
+      </w:pPr>
+      <w:r>
+        <w:rPr>
+          <w:rFonts w:ascii="Arial" w:cs="Arial" w:eastAsia="Arial" w:hAnsi="Arial"/>
+          <w:b/>
+          <w:bCs/>
+          <w:sz w:val="28"/>
+          <w:szCs w:val="28"/>
+          <w:rtl/>
+        </w:rPr>
+        <w:t xml:space="preserve">שקופית 21 – הקלטת קשר: הסמל מבקש פינוי</w:t>
+      </w:r>
+    </w:p>
+    <w:p>
+      <w:pPr>
+        <w:keepNext/>
+        <w:shd w:fill="F4F1EC" w:color="auto" w:val="clear"/>
+        <w:bidi/>
+        <w:spacing w:after="140"/>
+        <w:jc w:val="right"/>
+      </w:pPr>
+      <w:r>
+        <w:rPr>
+          <w:rFonts w:ascii="Arial" w:cs="Arial" w:eastAsia="Arial" w:hAnsi="Arial"/>
+          <w:b/>
+          <w:bCs/>
+          <w:color w:val="8A8F99"/>
+          <w:sz w:val="20"/>
+          <w:szCs w:val="20"/>
+          <w:rtl/>
+        </w:rPr>
+        <w:t xml:space="preserve">על המסך: </w:t>
+      </w:r>
+      <w:r>
+        <w:rPr>
+          <w:rFonts w:ascii="Arial" w:cs="Arial" w:eastAsia="Arial" w:hAnsi="Arial"/>
+          <w:color w:val="8A8F99"/>
+          <w:sz w:val="20"/>
+          <w:szCs w:val="20"/>
+          <w:rtl/>
+        </w:rPr>
+        <w:t xml:space="preserve">כרטיס הקלטה, 7.10, 07:45: הסמל מבקש פינוי. התמליל: חכים (מפקד כוח האכזרית): מוכרחים פינוי דחוף. קליין: חכים קבל, אין לנו איך לעזור לכם. אנחנו בניהול אש עם מחבלים.</w:t>
+      </w:r>
+    </w:p>
+    <w:p>
+      <w:pPr>
+        <w:bidi/>
+        <w:spacing w:after="140" w:line="360"/>
+        <w:jc w:val="right"/>
+      </w:pPr>
+      <w:r>
+        <w:rPr>
+          <w:rFonts w:ascii="Arial" w:cs="Arial" w:eastAsia="Arial" w:hAnsi="Arial"/>
+          <w:sz w:val="26"/>
+          <w:szCs w:val="26"/>
+          <w:rtl/>
+        </w:rPr>
+        <w:t xml:space="preserve">שעה בדיוק אחרי שהסמג״ד הכריז על מלחמה, חכים, מפקד כוח האכזרית, מבקש פינוי.</w:t>
       </w:r>
     </w:p>
     <w:p>
@@ -1904,7 +1971,23 @@
           <w:szCs w:val="22"/>
           <w:rtl/>
         </w:rPr>
-        <w:t xml:space="preserve">(לחיצה – הסרטון)</w:t>
+        <w:t xml:space="preserve">(לחיצה – ההקלטה מתנגנת)</w:t>
+      </w:r>
+    </w:p>
+    <w:p>
+      <w:pPr>
+        <w:bidi/>
+        <w:spacing w:after="140" w:line="360"/>
+        <w:jc w:val="right"/>
+      </w:pPr>
+      <w:r>
+        <w:rPr>
+          <w:rFonts w:ascii="Arial" w:cs="Arial" w:eastAsia="Arial" w:hAnsi="Arial"/>
+          <w:sz w:val="26"/>
+          <w:szCs w:val="26"/>
+          <w:rtl/>
+        </w:rPr>
+        <w:t xml:space="preserve">שעה. כל מה שסיפרתי עכשיו קרה בתוך שעה אחת.</w:t>
       </w:r>
     </w:p>
     <w:p>
@@ -1924,7 +2007,7 @@
           <w:szCs w:val="28"/>
           <w:rtl/>
         </w:rPr>
-        <w:t xml:space="preserve">שקופית 21 – באותו רגע שנפצעתי</w:t>
+        <w:t xml:space="preserve">שקופית 22 – מפת הקרב (שוב)</w:t>
       </w:r>
     </w:p>
     <w:p>
@@ -1955,119 +2038,7 @@
           <w:szCs w:val="20"/>
           <w:rtl/>
         </w:rPr>
-        <w:t xml:space="preserve">באותו רגע שנפצעתי, מחשבה אחת בלבד עברה בראשי… ומתחת: תמיד לימדו אותנו: מי שלא ממשיך לתפקד – נשאר עם הטראומה. לצד זה תמונה מרגע הפינוי.</w:t>
-      </w:r>
-    </w:p>
-    <w:p>
-      <w:pPr>
-        <w:bidi/>
-        <w:spacing w:after="140" w:line="360"/>
-        <w:jc w:val="right"/>
-      </w:pPr>
-      <w:r>
-        <w:rPr>
-          <w:rFonts w:ascii="Arial" w:cs="Arial" w:eastAsia="Arial" w:hAnsi="Arial"/>
-          <w:sz w:val="26"/>
-          <w:szCs w:val="26"/>
-          <w:rtl/>
-        </w:rPr>
-        <w:t xml:space="preserve">אחרי בערך שעתיים של אש תופת, עמדתי ליד מישהו שירה, ופתאום הבחנתי שהוא נפגע. לא כל כך הבנתי איפה.</w:t>
-      </w:r>
-    </w:p>
-    <w:p>
-      <w:pPr>
-        <w:bidi/>
-        <w:spacing w:after="140" w:line="360"/>
-        <w:jc w:val="right"/>
-      </w:pPr>
-      <w:r>
-        <w:rPr>
-          <w:rFonts w:ascii="Arial" w:cs="Arial" w:eastAsia="Arial" w:hAnsi="Arial"/>
-          <w:sz w:val="26"/>
-          <w:szCs w:val="26"/>
-          <w:rtl/>
-        </w:rPr>
-        <w:t xml:space="preserve">תמכתי בו בזמן שהוא נשכב על הרצפה. הסתכלתי, וראיתי שמטפטף לו דם מהקסדה. הורדתי לו אותה, וראיתי שהוא חטף כדור בראש.</w:t>
-      </w:r>
-    </w:p>
-    <w:p>
-      <w:pPr>
-        <w:bidi/>
-        <w:spacing w:after="140" w:line="360"/>
-        <w:jc w:val="right"/>
-      </w:pPr>
-      <w:r>
-        <w:rPr>
-          <w:rFonts w:ascii="Arial" w:cs="Arial" w:eastAsia="Arial" w:hAnsi="Arial"/>
-          <w:sz w:val="26"/>
-          <w:szCs w:val="26"/>
-          <w:rtl/>
-        </w:rPr>
-        <w:t xml:space="preserve">הוא אמר לי כמה מילים, נשם כמה נשימות, והסיטואציה היא שבן אדם מאבד לי הכרה בידיים, ובמקביל מפרקים אותנו באש. ואני אומר לו משהו כמו שאני אוהב אותו, אבל אני לא יודע מה לעשות. אני חייב לחזור להילחם.</w:t>
-      </w:r>
-    </w:p>
-    <w:p>
-      <w:pPr>
-        <w:bidi/>
-        <w:spacing w:after="140" w:line="360"/>
-        <w:jc w:val="right"/>
-      </w:pPr>
-      <w:r>
-        <w:rPr>
-          <w:rFonts w:ascii="Arial" w:cs="Arial" w:eastAsia="Arial" w:hAnsi="Arial"/>
-          <w:sz w:val="26"/>
-          <w:szCs w:val="26"/>
-          <w:rtl/>
-        </w:rPr>
-        <w:t xml:space="preserve">הוצאתי את היד שלי והתחלתי לירות. תוך כדי הרגשתי כמו בוקס קטן בכתף. נגעתי בזה, וראיתי שיורד לי המון המון דם.</w:t>
-      </w:r>
-    </w:p>
-    <w:p>
-      <w:pPr>
-        <w:bidi/>
-        <w:spacing w:after="140" w:line="360"/>
-        <w:jc w:val="right"/>
-      </w:pPr>
-      <w:r>
-        <w:rPr>
-          <w:rFonts w:ascii="Arial" w:cs="Arial" w:eastAsia="Arial" w:hAnsi="Arial"/>
-          <w:sz w:val="26"/>
-          <w:szCs w:val="26"/>
-          <w:rtl/>
-        </w:rPr>
-        <w:t xml:space="preserve">הוצאתי חוסם עורקים, הנחתי אותו על היד, וחבר הידק לי. באותו שלב היינו שלושה שעומדים, כולל אני. חוסם עורקים זה כל כך כואב. כאב לי ברמה שאני לא יכול להסביר.</w:t>
-      </w:r>
-    </w:p>
-    <w:p>
-      <w:pPr>
-        <w:bidi/>
-        <w:spacing w:after="140" w:line="360"/>
-        <w:jc w:val="right"/>
-      </w:pPr>
-      <w:r>
-        <w:rPr>
-          <w:rFonts w:ascii="Arial" w:cs="Arial" w:eastAsia="Arial" w:hAnsi="Arial"/>
-          <w:sz w:val="26"/>
-          <w:szCs w:val="26"/>
-          <w:rtl/>
-        </w:rPr>
-        <w:t xml:space="preserve">האמת שלא ידעתי איך להסביר כמה כאב לי, עד שבדקתי. בסולם הכאב, חוסם עורקים נמצא אחד מתחת ללידה.</w:t>
-      </w:r>
-    </w:p>
-    <w:p>
-      <w:pPr>
-        <w:bidi/>
-        <w:spacing w:after="140" w:line="360"/>
-        <w:jc w:val="right"/>
-      </w:pPr>
-      <w:r>
-        <w:rPr>
-          <w:rFonts w:ascii="Arial" w:cs="Arial" w:eastAsia="Arial" w:hAnsi="Arial"/>
-          <w:sz w:val="26"/>
-          <w:szCs w:val="26"/>
-          <w:rtl/>
-        </w:rPr>
-        <w:t xml:space="preserve">אז הנשים בקהל מבינות עכשיו בדיוק על מה אני מדבר.</w:t>
+        <w:t xml:space="preserve">שוב מפת הקרב בצילום אוויר, עם אותן תוויות: מוצב סופה, קיבוץ סופה, המחבלים, הנגמ״ש, אנדרטת דנגור.</w:t>
       </w:r>
     </w:p>
     <w:p>
@@ -2086,39 +2057,7 @@
           <w:szCs w:val="22"/>
           <w:rtl/>
         </w:rPr>
-        <w:t xml:space="preserve">(לחכות רגע לצחוק)</w:t>
-      </w:r>
-    </w:p>
-    <w:p>
-      <w:pPr>
-        <w:bidi/>
-        <w:spacing w:after="140" w:line="360"/>
-        <w:jc w:val="right"/>
-      </w:pPr>
-      <w:r>
-        <w:rPr>
-          <w:rFonts w:ascii="Arial" w:cs="Arial" w:eastAsia="Arial" w:hAnsi="Arial"/>
-          <w:sz w:val="26"/>
-          <w:szCs w:val="26"/>
-          <w:rtl/>
-        </w:rPr>
-        <w:t xml:space="preserve">נשכבתי על הרצפה, ככה כמו שאתם רואים בתמונה, וניסיתי להירדם. חשבתי שאני פשוט בסיוט, ושאולי אם אשן זה יעזור לי. אבל ראיתי שזה מלחיץ את החבר׳ה, אז חזרתי לתפקד.</w:t>
-      </w:r>
-    </w:p>
-    <w:p>
-      <w:pPr>
-        <w:bidi/>
-        <w:spacing w:after="140" w:line="360"/>
-        <w:jc w:val="right"/>
-      </w:pPr>
-      <w:r>
-        <w:rPr>
-          <w:rFonts w:ascii="Arial" w:cs="Arial" w:eastAsia="Arial" w:hAnsi="Arial"/>
-          <w:sz w:val="26"/>
-          <w:szCs w:val="26"/>
-          <w:rtl/>
-        </w:rPr>
-        <w:t xml:space="preserve">באותו רגע הבנתי שאין לי ברירה. נזכרתי שכל הזמן אמרו לנו שמי שלא מתפקד בקרב, נשאר עם הטראומה.</w:t>
+        <w:t xml:space="preserve">(חוזרים למפה: להראות שוב איפה עמד הנגמ״ש ומאיפה ירו עליו, לפני שממשיכים למה שקרה בתוך המוצב)</w:t>
       </w:r>
     </w:p>
     <w:p>
@@ -2138,7 +2077,7 @@
           <w:szCs w:val="28"/>
           <w:rtl/>
         </w:rPr>
-        <w:t xml:space="preserve">שקופית 22 – הקלטת קשר: הסמל מבקש פינוי</w:t>
+        <w:t xml:space="preserve">שקופית 23 – בינתיים, בתוך המוצב</w:t>
       </w:r>
     </w:p>
     <w:p>
@@ -2169,23 +2108,23 @@
           <w:szCs w:val="20"/>
           <w:rtl/>
         </w:rPr>
-        <w:t xml:space="preserve">כרטיס הקלטה, 7.10, 07:45: הסמל מבקש פינוי. התמליל: חכים (מפקד כוח האכזרית): מוכרחים פינוי דחוף. קליין: חכים קבל, אין לנו איך לעזור לכם. אנחנו בניהול אש עם מחבלים.</w:t>
-      </w:r>
-    </w:p>
-    <w:p>
-      <w:pPr>
-        <w:bidi/>
-        <w:spacing w:after="140" w:line="360"/>
-        <w:jc w:val="right"/>
-      </w:pPr>
-      <w:r>
-        <w:rPr>
-          <w:rFonts w:ascii="Arial" w:cs="Arial" w:eastAsia="Arial" w:hAnsi="Arial"/>
-          <w:sz w:val="26"/>
-          <w:szCs w:val="26"/>
-          <w:rtl/>
-        </w:rPr>
-        <w:t xml:space="preserve">שעה בדיוק אחרי שהסמג״ד הכריז על מלחמה, חכים, מפקד כוח האכזרית, מבקש פינוי.</w:t>
+        <w:t xml:space="preserve">סרטון אנכי מתוך מוצב סופה, והכותרת: בינתיים, בתוך המוצב.</w:t>
+      </w:r>
+    </w:p>
+    <w:p>
+      <w:pPr>
+        <w:bidi/>
+        <w:spacing w:after="140" w:line="360"/>
+        <w:jc w:val="right"/>
+      </w:pPr>
+      <w:r>
+        <w:rPr>
+          <w:rFonts w:ascii="Arial" w:cs="Arial" w:eastAsia="Arial" w:hAnsi="Arial"/>
+          <w:sz w:val="26"/>
+          <w:szCs w:val="26"/>
+          <w:rtl/>
+        </w:rPr>
+        <w:t xml:space="preserve">אני לא הייתי שם. זה סרטון מתוך המוצב.</w:t>
       </w:r>
     </w:p>
     <w:p>
@@ -2204,23 +2143,7 @@
           <w:szCs w:val="22"/>
           <w:rtl/>
         </w:rPr>
-        <w:t xml:space="preserve">(לחיצה – ההקלטה מתנגנת)</w:t>
-      </w:r>
-    </w:p>
-    <w:p>
-      <w:pPr>
-        <w:bidi/>
-        <w:spacing w:after="140" w:line="360"/>
-        <w:jc w:val="right"/>
-      </w:pPr>
-      <w:r>
-        <w:rPr>
-          <w:rFonts w:ascii="Arial" w:cs="Arial" w:eastAsia="Arial" w:hAnsi="Arial"/>
-          <w:sz w:val="26"/>
-          <w:szCs w:val="26"/>
-          <w:rtl/>
-        </w:rPr>
-        <w:t xml:space="preserve">שעה. כל מה שסיפרתי עכשיו קרה בתוך שעה אחת.</w:t>
+        <w:t xml:space="preserve">(לחיצה – הסרטון)</w:t>
       </w:r>
     </w:p>
     <w:p>
@@ -2240,7 +2163,7 @@
           <w:szCs w:val="28"/>
           <w:rtl/>
         </w:rPr>
-        <w:t xml:space="preserve">שקופית 23 – הנגמ״ש שלנו</w:t>
+        <w:t xml:space="preserve">שקופית 24 – באותו רגע שנפצעתי</w:t>
       </w:r>
     </w:p>
     <w:p>
@@ -2271,23 +2194,170 @@
           <w:szCs w:val="20"/>
           <w:rtl/>
         </w:rPr>
-        <w:t xml:space="preserve">תמונה גדולה של הנגמ״ש ההרוס יום אחרי הקרב. מתחת: הנגמ״ש שלנו, מצולם מהמקום שבו עמדו המחבלים.</w:t>
-      </w:r>
-    </w:p>
-    <w:p>
-      <w:pPr>
-        <w:bidi/>
-        <w:spacing w:after="140" w:line="360"/>
-        <w:jc w:val="right"/>
-      </w:pPr>
-      <w:r>
-        <w:rPr>
-          <w:rFonts w:ascii="Arial" w:cs="Arial" w:eastAsia="Arial" w:hAnsi="Arial"/>
-          <w:sz w:val="26"/>
-          <w:szCs w:val="26"/>
-          <w:rtl/>
-        </w:rPr>
-        <w:t xml:space="preserve">זה הנגמ״ש שלנו, יום אחרי הקרב. התמונה צולמה מהמקום שבו עמדו המחבלים. ככה זה נראה מהצד שלהם.</w:t>
+        <w:t xml:space="preserve">באותו רגע שנפצעתי, מחשבה אחת בלבד עברה בראשי… ומתחת: תמיד לימדו אותנו: מי שלא ממשיך לתפקד – נשאר עם הטראומה. לצד זה תמונה מרגע הפינוי.</w:t>
+      </w:r>
+    </w:p>
+    <w:p>
+      <w:pPr>
+        <w:bidi/>
+        <w:spacing w:after="140" w:line="360"/>
+        <w:jc w:val="right"/>
+      </w:pPr>
+      <w:r>
+        <w:rPr>
+          <w:rFonts w:ascii="Arial" w:cs="Arial" w:eastAsia="Arial" w:hAnsi="Arial"/>
+          <w:sz w:val="26"/>
+          <w:szCs w:val="26"/>
+          <w:rtl/>
+        </w:rPr>
+        <w:t xml:space="preserve">אחרי בערך שעתיים של אש תופת, עמדתי ליד מישהו שירה, ופתאום הבחנתי שהוא נפגע. לא כל כך הבנתי איפה.</w:t>
+      </w:r>
+    </w:p>
+    <w:p>
+      <w:pPr>
+        <w:bidi/>
+        <w:spacing w:after="140" w:line="360"/>
+        <w:jc w:val="right"/>
+      </w:pPr>
+      <w:r>
+        <w:rPr>
+          <w:rFonts w:ascii="Arial" w:cs="Arial" w:eastAsia="Arial" w:hAnsi="Arial"/>
+          <w:sz w:val="26"/>
+          <w:szCs w:val="26"/>
+          <w:rtl/>
+        </w:rPr>
+        <w:t xml:space="preserve">תמכתי בו בזמן שהוא נשכב על הרצפה. הסתכלתי, וראיתי שמטפטף לו דם מהקסדה. הורדתי לו אותה, וראיתי שהוא חטף כדור בראש.</w:t>
+      </w:r>
+    </w:p>
+    <w:p>
+      <w:pPr>
+        <w:bidi/>
+        <w:spacing w:after="140" w:line="360"/>
+        <w:jc w:val="right"/>
+      </w:pPr>
+      <w:r>
+        <w:rPr>
+          <w:rFonts w:ascii="Arial" w:cs="Arial" w:eastAsia="Arial" w:hAnsi="Arial"/>
+          <w:sz w:val="26"/>
+          <w:szCs w:val="26"/>
+          <w:rtl/>
+        </w:rPr>
+        <w:t xml:space="preserve">הוא אמר לי כמה מילים, נשם כמה נשימות, והסיטואציה היא שבן אדם מאבד לי הכרה בידיים, ובמקביל מפרקים אותנו באש. ואני אומר לו משהו כמו שאני אוהב אותו, אבל אני לא יודע מה לעשות. אני חייב לחזור להילחם.</w:t>
+      </w:r>
+    </w:p>
+    <w:p>
+      <w:pPr>
+        <w:bidi/>
+        <w:spacing w:after="140" w:line="360"/>
+        <w:jc w:val="right"/>
+      </w:pPr>
+      <w:r>
+        <w:rPr>
+          <w:rFonts w:ascii="Arial" w:cs="Arial" w:eastAsia="Arial" w:hAnsi="Arial"/>
+          <w:sz w:val="26"/>
+          <w:szCs w:val="26"/>
+          <w:rtl/>
+        </w:rPr>
+        <w:t xml:space="preserve">הוצאתי את היד שלי והתחלתי לירות. תוך כדי הרגשתי כמו בוקס קטן בכתף. נגעתי בזה, וראיתי שיורד לי המון המון דם.</w:t>
+      </w:r>
+    </w:p>
+    <w:p>
+      <w:pPr>
+        <w:bidi/>
+        <w:spacing w:after="140" w:line="360"/>
+        <w:jc w:val="right"/>
+      </w:pPr>
+      <w:r>
+        <w:rPr>
+          <w:rFonts w:ascii="Arial" w:cs="Arial" w:eastAsia="Arial" w:hAnsi="Arial"/>
+          <w:sz w:val="26"/>
+          <w:szCs w:val="26"/>
+          <w:rtl/>
+        </w:rPr>
+        <w:t xml:space="preserve">הוצאתי חוסם עורקים, הנחתי אותו על היד, וחבר הידק לי. באותו שלב היינו שלושה שעומדים, כולל אני. חוסם עורקים זה כל כך כואב. כאב לי ברמה שאני לא יכול להסביר.</w:t>
+      </w:r>
+    </w:p>
+    <w:p>
+      <w:pPr>
+        <w:bidi/>
+        <w:spacing w:after="140" w:line="360"/>
+        <w:jc w:val="right"/>
+      </w:pPr>
+      <w:r>
+        <w:rPr>
+          <w:rFonts w:ascii="Arial" w:cs="Arial" w:eastAsia="Arial" w:hAnsi="Arial"/>
+          <w:sz w:val="26"/>
+          <w:szCs w:val="26"/>
+          <w:rtl/>
+        </w:rPr>
+        <w:t xml:space="preserve">האמת שלא ידעתי איך להסביר כמה כאב לי, עד שבדקתי. בסולם הכאב, חוסם עורקים נמצא אחד מתחת ללידה.</w:t>
+      </w:r>
+    </w:p>
+    <w:p>
+      <w:pPr>
+        <w:bidi/>
+        <w:spacing w:after="140" w:line="360"/>
+        <w:jc w:val="right"/>
+      </w:pPr>
+      <w:r>
+        <w:rPr>
+          <w:rFonts w:ascii="Arial" w:cs="Arial" w:eastAsia="Arial" w:hAnsi="Arial"/>
+          <w:sz w:val="26"/>
+          <w:szCs w:val="26"/>
+          <w:rtl/>
+        </w:rPr>
+        <w:t xml:space="preserve">אז הנשים בקהל מבינות עכשיו בדיוק על מה אני מדבר.</w:t>
+      </w:r>
+    </w:p>
+    <w:p>
+      <w:pPr>
+        <w:bidi/>
+        <w:spacing w:after="140" w:line="360"/>
+        <w:jc w:val="right"/>
+      </w:pPr>
+      <w:r>
+        <w:rPr>
+          <w:rFonts w:ascii="Arial" w:cs="Arial" w:eastAsia="Arial" w:hAnsi="Arial"/>
+          <w:i/>
+          <w:iCs/>
+          <w:color w:val="8A8F99"/>
+          <w:sz w:val="22"/>
+          <w:szCs w:val="22"/>
+          <w:rtl/>
+        </w:rPr>
+        <w:t xml:space="preserve">(לחכות רגע לצחוק)</w:t>
+      </w:r>
+    </w:p>
+    <w:p>
+      <w:pPr>
+        <w:bidi/>
+        <w:spacing w:after="140" w:line="360"/>
+        <w:jc w:val="right"/>
+      </w:pPr>
+      <w:r>
+        <w:rPr>
+          <w:rFonts w:ascii="Arial" w:cs="Arial" w:eastAsia="Arial" w:hAnsi="Arial"/>
+          <w:sz w:val="26"/>
+          <w:szCs w:val="26"/>
+          <w:rtl/>
+        </w:rPr>
+        <w:t xml:space="preserve">נשכבתי על הרצפה, ככה כמו שאתם רואים בתמונה, וניסיתי להירדם. חשבתי שאני פשוט בסיוט, ושאולי אם אשן זה יעזור לי. אבל ראיתי שזה מלחיץ את החבר׳ה, אז חזרתי לתפקד.</w:t>
+      </w:r>
+    </w:p>
+    <w:p>
+      <w:pPr>
+        <w:bidi/>
+        <w:spacing w:after="140" w:line="360"/>
+        <w:jc w:val="right"/>
+      </w:pPr>
+      <w:r>
+        <w:rPr>
+          <w:rFonts w:ascii="Arial" w:cs="Arial" w:eastAsia="Arial" w:hAnsi="Arial"/>
+          <w:sz w:val="26"/>
+          <w:szCs w:val="26"/>
+          <w:rtl/>
+        </w:rPr>
+        <w:t xml:space="preserve">באותו רגע הבנתי שאין לי ברירה. נזכרתי שכל הזמן אמרו לנו שמי שלא מתפקד בקרב, נשאר עם הטראומה.</w:t>
       </w:r>
     </w:p>
     <w:p>
@@ -2307,7 +2377,7 @@
           <w:szCs w:val="28"/>
           <w:rtl/>
         </w:rPr>
-        <w:t xml:space="preserve">שקופית 24 – הקלטת קשר: כולם מבקשים פינוי</w:t>
+        <w:t xml:space="preserve">שקופית 25 – הקלטת קשר: כולם מבקשים פינוי</w:t>
       </w:r>
     </w:p>
     <w:p>
@@ -2409,7 +2479,7 @@
           <w:szCs w:val="28"/>
           <w:rtl/>
         </w:rPr>
-        <w:t xml:space="preserve">שקופית 25 – הקלטת קשר: קליין נותן פקודה</w:t>
+        <w:t xml:space="preserve">שקופית 26 – הקלטת קשר: קליין נותן פקודה</w:t>
       </w:r>
     </w:p>
     <w:p>
@@ -2495,7 +2565,7 @@
           <w:szCs w:val="28"/>
           <w:rtl/>
         </w:rPr>
-        <w:t xml:space="preserve">שקופית 26 – הפינוי</w:t>
+        <w:t xml:space="preserve">שקופית 27 – הפינוי</w:t>
       </w:r>
     </w:p>
     <w:p>
@@ -2562,7 +2632,7 @@
           <w:szCs w:val="28"/>
           <w:rtl/>
         </w:rPr>
-        <w:t xml:space="preserve">שקופית 27 – ההודעה הקולית מסורוקה</w:t>
+        <w:t xml:space="preserve">שקופית 28 – ההודעה הקולית מסורוקה</w:t>
       </w:r>
     </w:p>
     <w:p>
@@ -2664,7 +2734,7 @@
           <w:szCs w:val="28"/>
           <w:rtl/>
         </w:rPr>
-        <w:t xml:space="preserve">שקופית 28 – האמת?</w:t>
+        <w:t xml:space="preserve">שקופית 29 – האמת?</w:t>
       </w:r>
     </w:p>
     <w:p>
@@ -2795,7 +2865,7 @@
           <w:szCs w:val="28"/>
           <w:rtl/>
         </w:rPr>
-        <w:t xml:space="preserve">שקופית 29 – פרק 04</w:t>
+        <w:t xml:space="preserve">שקופית 30 – פרק 04</w:t>
       </w:r>
     </w:p>
     <w:p>
@@ -2862,7 +2932,7 @@
           <w:szCs w:val="28"/>
           <w:rtl/>
         </w:rPr>
-        <w:t xml:space="preserve">שקופית 30 – הדבר הכי קשה לא היה הפציעה</w:t>
+        <w:t xml:space="preserve">שקופית 31 – הדבר הכי קשה לא היה הפציעה</w:t>
       </w:r>
     </w:p>
     <w:p>
@@ -2996,7 +3066,7 @@
           <w:szCs w:val="28"/>
           <w:rtl/>
         </w:rPr>
-        <w:t xml:space="preserve">שקופית 31 – מה שאף אחד לא מכין אותך אליו</w:t>
+        <w:t xml:space="preserve">שקופית 32 – מה שאף אחד לא מכין אותך אליו</w:t>
       </w:r>
     </w:p>
     <w:p>
@@ -3127,7 +3197,7 @@
           <w:szCs w:val="28"/>
           <w:rtl/>
         </w:rPr>
-        <w:t xml:space="preserve">שקופית 32 – מאז</w:t>
+        <w:t xml:space="preserve">שקופית 33 – מאז</w:t>
       </w:r>
     </w:p>
     <w:p>
@@ -3223,7 +3293,7 @@
           <w:szCs w:val="28"/>
           <w:rtl/>
         </w:rPr>
-        <w:t xml:space="preserve">שקופית 33 – פרק 05</w:t>
+        <w:t xml:space="preserve">שקופית 34 – פרק 05</w:t>
       </w:r>
     </w:p>
     <w:p>
@@ -3290,7 +3360,7 @@
           <w:szCs w:val="28"/>
           <w:rtl/>
         </w:rPr>
-        <w:t xml:space="preserve">שקופית 34 – שלושה עקרונות לעבור משבר</w:t>
+        <w:t xml:space="preserve">שקופית 35 – שלושה עקרונות לעבור משבר</w:t>
       </w:r>
     </w:p>
     <w:p>
@@ -3357,7 +3427,7 @@
           <w:szCs w:val="28"/>
           <w:rtl/>
         </w:rPr>
-        <w:t xml:space="preserve">שקופית 35 – עיקרון 1</w:t>
+        <w:t xml:space="preserve">שקופית 36 – עיקרון 1</w:t>
       </w:r>
     </w:p>
     <w:p>
@@ -3440,7 +3510,7 @@
           <w:szCs w:val="28"/>
           <w:rtl/>
         </w:rPr>
-        <w:t xml:space="preserve">שקופית 36 – עיקרון 2</w:t>
+        <w:t xml:space="preserve">שקופית 37 – עיקרון 2</w:t>
       </w:r>
     </w:p>
     <w:p>
@@ -3523,7 +3593,7 @@
           <w:szCs w:val="28"/>
           <w:rtl/>
         </w:rPr>
-        <w:t xml:space="preserve">שקופית 37 – עיקרון 3</w:t>
+        <w:t xml:space="preserve">שקופית 38 – עיקרון 3</w:t>
       </w:r>
     </w:p>
     <w:p>
@@ -3635,7 +3705,7 @@
           <w:szCs w:val="28"/>
           <w:rtl/>
         </w:rPr>
-        <w:t xml:space="preserve">שקופית 38 – פרק 06</w:t>
+        <w:t xml:space="preserve">שקופית 39 – פרק 06</w:t>
       </w:r>
     </w:p>
     <w:p>
@@ -3702,7 +3772,7 @@
           <w:szCs w:val="28"/>
           <w:rtl/>
         </w:rPr>
-        <w:t xml:space="preserve">שקופית 39 – מה אני עושה עם זה היום</w:t>
+        <w:t xml:space="preserve">שקופית 40 – מה אני עושה עם זה היום</w:t>
       </w:r>
     </w:p>
     <w:p>
@@ -3817,7 +3887,7 @@
           <w:szCs w:val="28"/>
           <w:rtl/>
         </w:rPr>
-        <w:t xml:space="preserve">שקופית 40 – בוחר מה עושים מכאן</w:t>
+        <w:t xml:space="preserve">שקופית 41 – בוחר מה עושים מכאן</w:t>
       </w:r>
     </w:p>
     <w:p>
@@ -3970,7 +4040,7 @@
           <w:szCs w:val="28"/>
           <w:rtl/>
         </w:rPr>
-        <w:t xml:space="preserve">שקופית 41 – ההחלטה</w:t>
+        <w:t xml:space="preserve">שקופית 42 – ההחלטה</w:t>
       </w:r>
     </w:p>
     <w:p>
@@ -4085,7 +4155,7 @@
           <w:szCs w:val="28"/>
           <w:rtl/>
         </w:rPr>
-        <w:t xml:space="preserve">שקופית 42 – תודה</w:t>
+        <w:t xml:space="preserve">שקופית 43 – תודה</w:t>
       </w:r>
     </w:p>
     <w:p>

</xml_diff>

<commit_message>
Chapter 03 'Gaza line', larger Gaza maps, redrawn sector diagram with the unit emblem, follow live order (41 slides)
Co-Authored-By: Claude Opus 5.5 <noreply@anthropic.com>
Claude-Session: https://claude.ai/code/session_01VJ4ffGR4QBf998EQw4XNfv
</commit_message>
<xml_diff>
--- a/presentation/lecture-script.docx
+++ b/presentation/lecture-script.docx
@@ -1126,7 +1126,7 @@
           <w:szCs w:val="36"/>
           <w:rtl/>
         </w:rPr>
-        <w:t xml:space="preserve">פרק 03 – 7 באוקטובר</w:t>
+        <w:t xml:space="preserve">פרק 03 – קו עזה</w:t>
       </w:r>
     </w:p>
     <w:p>
@@ -1177,7 +1177,7 @@
           <w:szCs w:val="20"/>
           <w:rtl/>
         </w:rPr>
-        <w:t xml:space="preserve">שקופית פרק: 03 · 7 באוקטובר.</w:t>
+        <w:t xml:space="preserve">שקופית פרק: 03 · קו עזה.</w:t>
       </w:r>
     </w:p>
     <w:p>
@@ -1244,7 +1244,7 @@
           <w:szCs w:val="20"/>
           <w:rtl/>
         </w:rPr>
-        <w:t xml:space="preserve">שתי מפות: מימין מפת רצועת עזה והעוטף עם עיגול אדום סביב הגזרה, ומשמאל צילום אוויר של כרם שלום, סופה וניר יצחק.</w:t>
+        <w:t xml:space="preserve">שתי מפות גדולות, כמעט על כל המסך: מימין מפת רצועת עזה והעוטף עם עיגול אדום סביב הגזרה, ומשמאל צילום אוויר של כרם שלום, סופה וניר יצחק.</w:t>
       </w:r>
     </w:p>
     <w:p>
@@ -1311,7 +1311,7 @@
           <w:szCs w:val="20"/>
           <w:rtl/>
         </w:rPr>
-        <w:t xml:space="preserve">תרשים: סיירת נח״ל בגזרה הדרומית, מוצב כרם שלום ומוצב סופה, הפלס״ר מחולקת בין שניהם, ומתחת תורנות מטבח, צוות עתודה וכיתת כוננות. בתחתית: משמרת בוקר 05:30 · משמרת ערב 18:30.</w:t>
+        <w:t xml:space="preserve">סמל סיירת נח״ל ליד הכותרת, ותרשים עץ: סיירת נח״ל, ממנה שני המוצבים (כרם שלום – פלחה״ן, סופה – פלוגת נ״ט), שמתחברים לפלס״ר. מהפלס״ר שלוש משימות: כיתת כוננות, צוות עתודה ותורנות מטבח. מתחת: משמרת בוקר 05:30 · משמרת ערב 18:30.</w:t>
       </w:r>
     </w:p>
     <w:p>
@@ -2163,7 +2163,7 @@
           <w:szCs w:val="28"/>
           <w:rtl/>
         </w:rPr>
-        <w:t xml:space="preserve">שקופית 24 – באותו רגע שנפצעתי</w:t>
+        <w:t xml:space="preserve">שקופית 24 – הקלטת קשר: כולם מבקשים פינוי</w:t>
       </w:r>
     </w:p>
     <w:p>
@@ -2194,119 +2194,23 @@
           <w:szCs w:val="20"/>
           <w:rtl/>
         </w:rPr>
-        <w:t xml:space="preserve">באותו רגע שנפצעתי, מחשבה אחת בלבד עברה בראשי… ומתחת: תמיד לימדו אותנו: מי שלא ממשיך לתפקד – נשאר עם הטראומה. לצד זה תמונה מרגע הפינוי.</w:t>
-      </w:r>
-    </w:p>
-    <w:p>
-      <w:pPr>
-        <w:bidi/>
-        <w:spacing w:after="140" w:line="360"/>
-        <w:jc w:val="right"/>
-      </w:pPr>
-      <w:r>
-        <w:rPr>
-          <w:rFonts w:ascii="Arial" w:cs="Arial" w:eastAsia="Arial" w:hAnsi="Arial"/>
-          <w:sz w:val="26"/>
-          <w:szCs w:val="26"/>
-          <w:rtl/>
-        </w:rPr>
-        <w:t xml:space="preserve">אחרי בערך שעתיים של אש תופת, עמדתי ליד מישהו שירה, ופתאום הבחנתי שהוא נפגע. לא כל כך הבנתי איפה.</w:t>
-      </w:r>
-    </w:p>
-    <w:p>
-      <w:pPr>
-        <w:bidi/>
-        <w:spacing w:after="140" w:line="360"/>
-        <w:jc w:val="right"/>
-      </w:pPr>
-      <w:r>
-        <w:rPr>
-          <w:rFonts w:ascii="Arial" w:cs="Arial" w:eastAsia="Arial" w:hAnsi="Arial"/>
-          <w:sz w:val="26"/>
-          <w:szCs w:val="26"/>
-          <w:rtl/>
-        </w:rPr>
-        <w:t xml:space="preserve">תמכתי בו בזמן שהוא נשכב על הרצפה. הסתכלתי, וראיתי שמטפטף לו דם מהקסדה. הורדתי לו אותה, וראיתי שהוא חטף כדור בראש.</w:t>
-      </w:r>
-    </w:p>
-    <w:p>
-      <w:pPr>
-        <w:bidi/>
-        <w:spacing w:after="140" w:line="360"/>
-        <w:jc w:val="right"/>
-      </w:pPr>
-      <w:r>
-        <w:rPr>
-          <w:rFonts w:ascii="Arial" w:cs="Arial" w:eastAsia="Arial" w:hAnsi="Arial"/>
-          <w:sz w:val="26"/>
-          <w:szCs w:val="26"/>
-          <w:rtl/>
-        </w:rPr>
-        <w:t xml:space="preserve">הוא אמר לי כמה מילים, נשם כמה נשימות, והסיטואציה היא שבן אדם מאבד לי הכרה בידיים, ובמקביל מפרקים אותנו באש. ואני אומר לו משהו כמו שאני אוהב אותו, אבל אני לא יודע מה לעשות. אני חייב לחזור להילחם.</w:t>
-      </w:r>
-    </w:p>
-    <w:p>
-      <w:pPr>
-        <w:bidi/>
-        <w:spacing w:after="140" w:line="360"/>
-        <w:jc w:val="right"/>
-      </w:pPr>
-      <w:r>
-        <w:rPr>
-          <w:rFonts w:ascii="Arial" w:cs="Arial" w:eastAsia="Arial" w:hAnsi="Arial"/>
-          <w:sz w:val="26"/>
-          <w:szCs w:val="26"/>
-          <w:rtl/>
-        </w:rPr>
-        <w:t xml:space="preserve">הוצאתי את היד שלי והתחלתי לירות. תוך כדי הרגשתי כמו בוקס קטן בכתף. נגעתי בזה, וראיתי שיורד לי המון המון דם.</w:t>
-      </w:r>
-    </w:p>
-    <w:p>
-      <w:pPr>
-        <w:bidi/>
-        <w:spacing w:after="140" w:line="360"/>
-        <w:jc w:val="right"/>
-      </w:pPr>
-      <w:r>
-        <w:rPr>
-          <w:rFonts w:ascii="Arial" w:cs="Arial" w:eastAsia="Arial" w:hAnsi="Arial"/>
-          <w:sz w:val="26"/>
-          <w:szCs w:val="26"/>
-          <w:rtl/>
-        </w:rPr>
-        <w:t xml:space="preserve">הוצאתי חוסם עורקים, הנחתי אותו על היד, וחבר הידק לי. באותו שלב היינו שלושה שעומדים, כולל אני. חוסם עורקים זה כל כך כואב. כאב לי ברמה שאני לא יכול להסביר.</w:t>
-      </w:r>
-    </w:p>
-    <w:p>
-      <w:pPr>
-        <w:bidi/>
-        <w:spacing w:after="140" w:line="360"/>
-        <w:jc w:val="right"/>
-      </w:pPr>
-      <w:r>
-        <w:rPr>
-          <w:rFonts w:ascii="Arial" w:cs="Arial" w:eastAsia="Arial" w:hAnsi="Arial"/>
-          <w:sz w:val="26"/>
-          <w:szCs w:val="26"/>
-          <w:rtl/>
-        </w:rPr>
-        <w:t xml:space="preserve">האמת שלא ידעתי איך להסביר כמה כאב לי, עד שבדקתי. בסולם הכאב, חוסם עורקים נמצא אחד מתחת ללידה.</w:t>
-      </w:r>
-    </w:p>
-    <w:p>
-      <w:pPr>
-        <w:bidi/>
-        <w:spacing w:after="140" w:line="360"/>
-        <w:jc w:val="right"/>
-      </w:pPr>
-      <w:r>
-        <w:rPr>
-          <w:rFonts w:ascii="Arial" w:cs="Arial" w:eastAsia="Arial" w:hAnsi="Arial"/>
-          <w:sz w:val="26"/>
-          <w:szCs w:val="26"/>
-          <w:rtl/>
-        </w:rPr>
-        <w:t xml:space="preserve">אז הנשים בקהל מבינות עכשיו בדיוק על מה אני מדבר.</w:t>
+        <w:t xml:space="preserve">כרטיס הקלטה, דקות אחרי 07:45: כל הכוחות באזור עולים לקשר. כולם מבקשים פינוי. התמליל: קליין: חמ״ל מקליין, תן לי דוח מצב על כוחות פינוי. החמ״ליסט: אין פינוי כרגע. קליין: מה אתה אומר לי? אתה החמ״ל, אחי!</w:t>
+      </w:r>
+    </w:p>
+    <w:p>
+      <w:pPr>
+        <w:bidi/>
+        <w:spacing w:after="140" w:line="360"/>
+        <w:jc w:val="right"/>
+      </w:pPr>
+      <w:r>
+        <w:rPr>
+          <w:rFonts w:ascii="Arial" w:cs="Arial" w:eastAsia="Arial" w:hAnsi="Arial"/>
+          <w:sz w:val="26"/>
+          <w:szCs w:val="26"/>
+          <w:rtl/>
+        </w:rPr>
+        <w:t xml:space="preserve">דקות אחר כך, כל הכוחות באזור עולים לקשר ומבקשים פינוי.</w:t>
       </w:r>
     </w:p>
     <w:p>
@@ -2325,39 +2229,23 @@
           <w:szCs w:val="22"/>
           <w:rtl/>
         </w:rPr>
-        <w:t xml:space="preserve">(לחכות רגע לצחוק)</w:t>
-      </w:r>
-    </w:p>
-    <w:p>
-      <w:pPr>
-        <w:bidi/>
-        <w:spacing w:after="140" w:line="360"/>
-        <w:jc w:val="right"/>
-      </w:pPr>
-      <w:r>
-        <w:rPr>
-          <w:rFonts w:ascii="Arial" w:cs="Arial" w:eastAsia="Arial" w:hAnsi="Arial"/>
-          <w:sz w:val="26"/>
-          <w:szCs w:val="26"/>
-          <w:rtl/>
-        </w:rPr>
-        <w:t xml:space="preserve">נשכבתי על הרצפה, ככה כמו שאתם רואים בתמונה, וניסיתי להירדם. חשבתי שאני פשוט בסיוט, ושאולי אם אשן זה יעזור לי. אבל ראיתי שזה מלחיץ את החבר׳ה, אז חזרתי לתפקד.</w:t>
-      </w:r>
-    </w:p>
-    <w:p>
-      <w:pPr>
-        <w:bidi/>
-        <w:spacing w:after="140" w:line="360"/>
-        <w:jc w:val="right"/>
-      </w:pPr>
-      <w:r>
-        <w:rPr>
-          <w:rFonts w:ascii="Arial" w:cs="Arial" w:eastAsia="Arial" w:hAnsi="Arial"/>
-          <w:sz w:val="26"/>
-          <w:szCs w:val="26"/>
-          <w:rtl/>
-        </w:rPr>
-        <w:t xml:space="preserve">באותו רגע הבנתי שאין לי ברירה. נזכרתי שכל הזמן אמרו לנו שמי שלא מתפקד בקרב, נשאר עם הטראומה.</w:t>
+        <w:t xml:space="preserve">(לחיצה – ההקלטה מתנגנת עד הסוף)</w:t>
+      </w:r>
+    </w:p>
+    <w:p>
+      <w:pPr>
+        <w:bidi/>
+        <w:spacing w:after="140" w:line="360"/>
+        <w:jc w:val="right"/>
+      </w:pPr>
+      <w:r>
+        <w:rPr>
+          <w:rFonts w:ascii="Arial" w:cs="Arial" w:eastAsia="Arial" w:hAnsi="Arial"/>
+          <w:sz w:val="26"/>
+          <w:szCs w:val="26"/>
+          <w:rtl/>
+        </w:rPr>
+        <w:t xml:space="preserve">זה הרגע שבו הבנתי שאף אחד לא בא.</w:t>
       </w:r>
     </w:p>
     <w:p>
@@ -2377,7 +2265,7 @@
           <w:szCs w:val="28"/>
           <w:rtl/>
         </w:rPr>
-        <w:t xml:space="preserve">שקופית 25 – הקלטת קשר: כולם מבקשים פינוי</w:t>
+        <w:t xml:space="preserve">שקופית 25 – באותו רגע שנפצעתי</w:t>
       </w:r>
     </w:p>
     <w:p>
@@ -2408,23 +2296,119 @@
           <w:szCs w:val="20"/>
           <w:rtl/>
         </w:rPr>
-        <w:t xml:space="preserve">כרטיס הקלטה, דקות אחרי 07:45: כל הכוחות באזור עולים לקשר. כולם מבקשים פינוי. התמליל: קליין: חמ״ל מקליין, תן לי דוח מצב על כוחות פינוי. החמ״ליסט: אין פינוי כרגע. קליין: מה אתה אומר לי? אתה החמ״ל, אחי!</w:t>
-      </w:r>
-    </w:p>
-    <w:p>
-      <w:pPr>
-        <w:bidi/>
-        <w:spacing w:after="140" w:line="360"/>
-        <w:jc w:val="right"/>
-      </w:pPr>
-      <w:r>
-        <w:rPr>
-          <w:rFonts w:ascii="Arial" w:cs="Arial" w:eastAsia="Arial" w:hAnsi="Arial"/>
-          <w:sz w:val="26"/>
-          <w:szCs w:val="26"/>
-          <w:rtl/>
-        </w:rPr>
-        <w:t xml:space="preserve">דקות אחר כך, כל הכוחות באזור עולים לקשר ומבקשים פינוי.</w:t>
+        <w:t xml:space="preserve">באותו רגע שנפצעתי, מחשבה אחת בלבד עברה בראשי… ומתחת: תמיד לימדו אותנו: מי שלא ממשיך לתפקד – נשאר עם הטראומה. לצד זה תמונה מרגע הפינוי.</w:t>
+      </w:r>
+    </w:p>
+    <w:p>
+      <w:pPr>
+        <w:bidi/>
+        <w:spacing w:after="140" w:line="360"/>
+        <w:jc w:val="right"/>
+      </w:pPr>
+      <w:r>
+        <w:rPr>
+          <w:rFonts w:ascii="Arial" w:cs="Arial" w:eastAsia="Arial" w:hAnsi="Arial"/>
+          <w:sz w:val="26"/>
+          <w:szCs w:val="26"/>
+          <w:rtl/>
+        </w:rPr>
+        <w:t xml:space="preserve">אחרי בערך שעתיים של אש תופת, עמדתי ליד מישהו שירה, ופתאום הבחנתי שהוא נפגע. לא כל כך הבנתי איפה.</w:t>
+      </w:r>
+    </w:p>
+    <w:p>
+      <w:pPr>
+        <w:bidi/>
+        <w:spacing w:after="140" w:line="360"/>
+        <w:jc w:val="right"/>
+      </w:pPr>
+      <w:r>
+        <w:rPr>
+          <w:rFonts w:ascii="Arial" w:cs="Arial" w:eastAsia="Arial" w:hAnsi="Arial"/>
+          <w:sz w:val="26"/>
+          <w:szCs w:val="26"/>
+          <w:rtl/>
+        </w:rPr>
+        <w:t xml:space="preserve">תמכתי בו בזמן שהוא נשכב על הרצפה. הסתכלתי, וראיתי שמטפטף לו דם מהקסדה. הורדתי לו אותה, וראיתי שהוא חטף כדור בראש.</w:t>
+      </w:r>
+    </w:p>
+    <w:p>
+      <w:pPr>
+        <w:bidi/>
+        <w:spacing w:after="140" w:line="360"/>
+        <w:jc w:val="right"/>
+      </w:pPr>
+      <w:r>
+        <w:rPr>
+          <w:rFonts w:ascii="Arial" w:cs="Arial" w:eastAsia="Arial" w:hAnsi="Arial"/>
+          <w:sz w:val="26"/>
+          <w:szCs w:val="26"/>
+          <w:rtl/>
+        </w:rPr>
+        <w:t xml:space="preserve">הוא אמר לי כמה מילים, נשם כמה נשימות, והסיטואציה היא שבן אדם מאבד לי הכרה בידיים, ובמקביל מפרקים אותנו באש. ואני אומר לו משהו כמו שאני אוהב אותו, אבל אני לא יודע מה לעשות. אני חייב לחזור להילחם.</w:t>
+      </w:r>
+    </w:p>
+    <w:p>
+      <w:pPr>
+        <w:bidi/>
+        <w:spacing w:after="140" w:line="360"/>
+        <w:jc w:val="right"/>
+      </w:pPr>
+      <w:r>
+        <w:rPr>
+          <w:rFonts w:ascii="Arial" w:cs="Arial" w:eastAsia="Arial" w:hAnsi="Arial"/>
+          <w:sz w:val="26"/>
+          <w:szCs w:val="26"/>
+          <w:rtl/>
+        </w:rPr>
+        <w:t xml:space="preserve">הוצאתי את היד שלי והתחלתי לירות. תוך כדי הרגשתי כמו בוקס קטן בכתף. נגעתי בזה, וראיתי שיורד לי המון המון דם.</w:t>
+      </w:r>
+    </w:p>
+    <w:p>
+      <w:pPr>
+        <w:bidi/>
+        <w:spacing w:after="140" w:line="360"/>
+        <w:jc w:val="right"/>
+      </w:pPr>
+      <w:r>
+        <w:rPr>
+          <w:rFonts w:ascii="Arial" w:cs="Arial" w:eastAsia="Arial" w:hAnsi="Arial"/>
+          <w:sz w:val="26"/>
+          <w:szCs w:val="26"/>
+          <w:rtl/>
+        </w:rPr>
+        <w:t xml:space="preserve">הוצאתי חוסם עורקים, הנחתי אותו על היד, וחבר הידק לי. באותו שלב היינו שלושה שעומדים, כולל אני. חוסם עורקים זה כל כך כואב. כאב לי ברמה שאני לא יכול להסביר.</w:t>
+      </w:r>
+    </w:p>
+    <w:p>
+      <w:pPr>
+        <w:bidi/>
+        <w:spacing w:after="140" w:line="360"/>
+        <w:jc w:val="right"/>
+      </w:pPr>
+      <w:r>
+        <w:rPr>
+          <w:rFonts w:ascii="Arial" w:cs="Arial" w:eastAsia="Arial" w:hAnsi="Arial"/>
+          <w:sz w:val="26"/>
+          <w:szCs w:val="26"/>
+          <w:rtl/>
+        </w:rPr>
+        <w:t xml:space="preserve">האמת שלא ידעתי איך להסביר כמה כאב לי, עד שבדקתי. בסולם הכאב, חוסם עורקים נמצא אחד מתחת ללידה.</w:t>
+      </w:r>
+    </w:p>
+    <w:p>
+      <w:pPr>
+        <w:bidi/>
+        <w:spacing w:after="140" w:line="360"/>
+        <w:jc w:val="right"/>
+      </w:pPr>
+      <w:r>
+        <w:rPr>
+          <w:rFonts w:ascii="Arial" w:cs="Arial" w:eastAsia="Arial" w:hAnsi="Arial"/>
+          <w:sz w:val="26"/>
+          <w:szCs w:val="26"/>
+          <w:rtl/>
+        </w:rPr>
+        <w:t xml:space="preserve">אז הנשים בקהל מבינות עכשיו בדיוק על מה אני מדבר.</w:t>
       </w:r>
     </w:p>
     <w:p>
@@ -2443,23 +2427,39 @@
           <w:szCs w:val="22"/>
           <w:rtl/>
         </w:rPr>
-        <w:t xml:space="preserve">(לחיצה – ההקלטה מתנגנת עד הסוף)</w:t>
-      </w:r>
-    </w:p>
-    <w:p>
-      <w:pPr>
-        <w:bidi/>
-        <w:spacing w:after="140" w:line="360"/>
-        <w:jc w:val="right"/>
-      </w:pPr>
-      <w:r>
-        <w:rPr>
-          <w:rFonts w:ascii="Arial" w:cs="Arial" w:eastAsia="Arial" w:hAnsi="Arial"/>
-          <w:sz w:val="26"/>
-          <w:szCs w:val="26"/>
-          <w:rtl/>
-        </w:rPr>
-        <w:t xml:space="preserve">זה הרגע שבו הבנתי שאף אחד לא בא.</w:t>
+        <w:t xml:space="preserve">(לחכות רגע לצחוק)</w:t>
+      </w:r>
+    </w:p>
+    <w:p>
+      <w:pPr>
+        <w:bidi/>
+        <w:spacing w:after="140" w:line="360"/>
+        <w:jc w:val="right"/>
+      </w:pPr>
+      <w:r>
+        <w:rPr>
+          <w:rFonts w:ascii="Arial" w:cs="Arial" w:eastAsia="Arial" w:hAnsi="Arial"/>
+          <w:sz w:val="26"/>
+          <w:szCs w:val="26"/>
+          <w:rtl/>
+        </w:rPr>
+        <w:t xml:space="preserve">נשכבתי על הרצפה, ככה כמו שאתם רואים בתמונה, וניסיתי להירדם. חשבתי שאני פשוט בסיוט, ושאולי אם אשן זה יעזור לי. אבל ראיתי שזה מלחיץ את החבר׳ה, אז חזרתי לתפקד.</w:t>
+      </w:r>
+    </w:p>
+    <w:p>
+      <w:pPr>
+        <w:bidi/>
+        <w:spacing w:after="140" w:line="360"/>
+        <w:jc w:val="right"/>
+      </w:pPr>
+      <w:r>
+        <w:rPr>
+          <w:rFonts w:ascii="Arial" w:cs="Arial" w:eastAsia="Arial" w:hAnsi="Arial"/>
+          <w:sz w:val="26"/>
+          <w:szCs w:val="26"/>
+          <w:rtl/>
+        </w:rPr>
+        <w:t xml:space="preserve">באותו רגע הבנתי שאין לי ברירה. נזכרתי שכל הזמן אמרו לנו שמי שלא מתפקד בקרב, נשאר עם הטראומה.</w:t>
       </w:r>
     </w:p>
     <w:p>
@@ -2479,7 +2479,7 @@
           <w:szCs w:val="28"/>
           <w:rtl/>
         </w:rPr>
-        <w:t xml:space="preserve">שקופית 26 – הקלטת קשר: קליין נותן פקודה</w:t>
+        <w:t xml:space="preserve">שקופית 26 – הפינוי</w:t>
       </w:r>
     </w:p>
     <w:p>
@@ -2510,23 +2510,90 @@
           <w:szCs w:val="20"/>
           <w:rtl/>
         </w:rPr>
-        <w:t xml:space="preserve">כרטיס הקלטה, 7.10, 07:50: קליין נותן פקודה. והיא מאפסת אותנו. התמליל: תאפס אותם. תקפיאו מצב. תסגרו את כל הפינות. שימו ת׳פצועים באמצע, ואל תתנו למחבלים להגיע אליכם.</w:t>
-      </w:r>
-    </w:p>
-    <w:p>
-      <w:pPr>
-        <w:bidi/>
-        <w:spacing w:after="140" w:line="360"/>
-        <w:jc w:val="right"/>
-      </w:pPr>
-      <w:r>
-        <w:rPr>
-          <w:rFonts w:ascii="Arial" w:cs="Arial" w:eastAsia="Arial" w:hAnsi="Arial"/>
-          <w:sz w:val="26"/>
-          <w:szCs w:val="26"/>
-          <w:rtl/>
-        </w:rPr>
-        <w:t xml:space="preserve">באותו שלב של הקרב, קליין נותן לנו פקודה בקשר שמשפיעה על כל הלך הקרב.</w:t>
+        <w:t xml:space="preserve">תמונה מרגע הפינוי. מתחת: הפינוי. הצוות ליד הנגמ״ש, האלונקות על הקרקע.</w:t>
+      </w:r>
+    </w:p>
+    <w:p>
+      <w:pPr>
+        <w:bidi/>
+        <w:spacing w:after="140" w:line="360"/>
+        <w:jc w:val="right"/>
+      </w:pPr>
+      <w:r>
+        <w:rPr>
+          <w:rFonts w:ascii="Arial" w:cs="Arial" w:eastAsia="Arial" w:hAnsi="Arial"/>
+          <w:sz w:val="26"/>
+          <w:szCs w:val="26"/>
+          <w:rtl/>
+        </w:rPr>
+        <w:t xml:space="preserve">בערך 40 דקות אחרי שנפצעתי הגיע אלינו כוח של חיילות קרקל. הן נתנו לנו טיפול ראשוני ופינו אותנו באמבולנס לנקודת הפינוי האחורית. משם מסוק פינה אותי לסורוקה.</w:t>
+      </w:r>
+    </w:p>
+    <w:p>
+      <w:pPr>
+        <w:pStyle w:val="Heading2"/>
+        <w:keepNext/>
+        <w:bidi/>
+        <w:spacing w:after="80" w:before="320"/>
+        <w:jc w:val="right"/>
+      </w:pPr>
+      <w:r>
+        <w:rPr>
+          <w:rFonts w:ascii="Arial" w:cs="Arial" w:eastAsia="Arial" w:hAnsi="Arial"/>
+          <w:b/>
+          <w:bCs/>
+          <w:sz w:val="28"/>
+          <w:szCs w:val="28"/>
+          <w:rtl/>
+        </w:rPr>
+        <w:t xml:space="preserve">שקופית 27 – ההודעה הקולית מסורוקה</w:t>
+      </w:r>
+    </w:p>
+    <w:p>
+      <w:pPr>
+        <w:keepNext/>
+        <w:shd w:fill="F4F1EC" w:color="auto" w:val="clear"/>
+        <w:bidi/>
+        <w:spacing w:after="140"/>
+        <w:jc w:val="right"/>
+      </w:pPr>
+      <w:r>
+        <w:rPr>
+          <w:rFonts w:ascii="Arial" w:cs="Arial" w:eastAsia="Arial" w:hAnsi="Arial"/>
+          <w:b/>
+          <w:bCs/>
+          <w:color w:val="8A8F99"/>
+          <w:sz w:val="20"/>
+          <w:szCs w:val="20"/>
+          <w:rtl/>
+        </w:rPr>
+        <w:t xml:space="preserve">על המסך: </w:t>
+      </w:r>
+      <w:r>
+        <w:rPr>
+          <w:rFonts w:ascii="Arial" w:cs="Arial" w:eastAsia="Arial" w:hAnsi="Arial"/>
+          <w:color w:val="8A8F99"/>
+          <w:sz w:val="20"/>
+          <w:szCs w:val="20"/>
+          <w:rtl/>
+        </w:rPr>
+        <w:t xml:space="preserve">תמונה שלך על אלונקה בסורוקה, וכרטיס ההודעה הקולית עם התמליל המלא, שמסתיים ב: אוהב את כולם, נשיקות, נפגש.</w:t>
+      </w:r>
+    </w:p>
+    <w:p>
+      <w:pPr>
+        <w:bidi/>
+        <w:spacing w:after="140" w:line="360"/>
+        <w:jc w:val="right"/>
+      </w:pPr>
+      <w:r>
+        <w:rPr>
+          <w:rFonts w:ascii="Arial" w:cs="Arial" w:eastAsia="Arial" w:hAnsi="Arial"/>
+          <w:sz w:val="26"/>
+          <w:szCs w:val="26"/>
+          <w:rtl/>
+        </w:rPr>
+        <w:t xml:space="preserve">שעתיים אחרי הפינוי, מהמיטה בסורוקה, שלחתי לכולם הודעה קולית.</w:t>
       </w:r>
     </w:p>
     <w:p>
@@ -2545,7 +2612,23 @@
           <w:szCs w:val="22"/>
           <w:rtl/>
         </w:rPr>
-        <w:t xml:space="preserve">(לחיצה – ההקלטה מתנגנת)</w:t>
+        <w:t xml:space="preserve">(לחיצה – ההודעה מתנגנת עד הסוף)</w:t>
+      </w:r>
+    </w:p>
+    <w:p>
+      <w:pPr>
+        <w:bidi/>
+        <w:spacing w:after="140" w:line="360"/>
+        <w:jc w:val="right"/>
+      </w:pPr>
+      <w:r>
+        <w:rPr>
+          <w:rFonts w:ascii="Arial" w:cs="Arial" w:eastAsia="Arial" w:hAnsi="Arial"/>
+          <w:sz w:val="26"/>
+          <w:szCs w:val="26"/>
+          <w:rtl/>
+        </w:rPr>
+        <w:t xml:space="preserve">באותו רגע חשבתי שהחלק הקשה נגמר.</w:t>
       </w:r>
     </w:p>
     <w:p>
@@ -2565,176 +2648,7 @@
           <w:szCs w:val="28"/>
           <w:rtl/>
         </w:rPr>
-        <w:t xml:space="preserve">שקופית 27 – הפינוי</w:t>
-      </w:r>
-    </w:p>
-    <w:p>
-      <w:pPr>
-        <w:keepNext/>
-        <w:shd w:fill="F4F1EC" w:color="auto" w:val="clear"/>
-        <w:bidi/>
-        <w:spacing w:after="140"/>
-        <w:jc w:val="right"/>
-      </w:pPr>
-      <w:r>
-        <w:rPr>
-          <w:rFonts w:ascii="Arial" w:cs="Arial" w:eastAsia="Arial" w:hAnsi="Arial"/>
-          <w:b/>
-          <w:bCs/>
-          <w:color w:val="8A8F99"/>
-          <w:sz w:val="20"/>
-          <w:szCs w:val="20"/>
-          <w:rtl/>
-        </w:rPr>
-        <w:t xml:space="preserve">על המסך: </w:t>
-      </w:r>
-      <w:r>
-        <w:rPr>
-          <w:rFonts w:ascii="Arial" w:cs="Arial" w:eastAsia="Arial" w:hAnsi="Arial"/>
-          <w:color w:val="8A8F99"/>
-          <w:sz w:val="20"/>
-          <w:szCs w:val="20"/>
-          <w:rtl/>
-        </w:rPr>
-        <w:t xml:space="preserve">תמונה מרגע הפינוי. מתחת: הפינוי. הצוות ליד הנגמ״ש, האלונקות על הקרקע.</w:t>
-      </w:r>
-    </w:p>
-    <w:p>
-      <w:pPr>
-        <w:bidi/>
-        <w:spacing w:after="140" w:line="360"/>
-        <w:jc w:val="right"/>
-      </w:pPr>
-      <w:r>
-        <w:rPr>
-          <w:rFonts w:ascii="Arial" w:cs="Arial" w:eastAsia="Arial" w:hAnsi="Arial"/>
-          <w:sz w:val="26"/>
-          <w:szCs w:val="26"/>
-          <w:rtl/>
-        </w:rPr>
-        <w:t xml:space="preserve">בערך 40 דקות אחרי שנפצעתי הגיע אלינו כוח של חיילות קרקל. הן נתנו לנו טיפול ראשוני ופינו אותנו באמבולנס לנקודת הפינוי האחורית. משם מסוק פינה אותי לסורוקה.</w:t>
-      </w:r>
-    </w:p>
-    <w:p>
-      <w:pPr>
-        <w:pStyle w:val="Heading2"/>
-        <w:keepNext/>
-        <w:bidi/>
-        <w:spacing w:after="80" w:before="320"/>
-        <w:jc w:val="right"/>
-      </w:pPr>
-      <w:r>
-        <w:rPr>
-          <w:rFonts w:ascii="Arial" w:cs="Arial" w:eastAsia="Arial" w:hAnsi="Arial"/>
-          <w:b/>
-          <w:bCs/>
-          <w:sz w:val="28"/>
-          <w:szCs w:val="28"/>
-          <w:rtl/>
-        </w:rPr>
-        <w:t xml:space="preserve">שקופית 28 – ההודעה הקולית מסורוקה</w:t>
-      </w:r>
-    </w:p>
-    <w:p>
-      <w:pPr>
-        <w:keepNext/>
-        <w:shd w:fill="F4F1EC" w:color="auto" w:val="clear"/>
-        <w:bidi/>
-        <w:spacing w:after="140"/>
-        <w:jc w:val="right"/>
-      </w:pPr>
-      <w:r>
-        <w:rPr>
-          <w:rFonts w:ascii="Arial" w:cs="Arial" w:eastAsia="Arial" w:hAnsi="Arial"/>
-          <w:b/>
-          <w:bCs/>
-          <w:color w:val="8A8F99"/>
-          <w:sz w:val="20"/>
-          <w:szCs w:val="20"/>
-          <w:rtl/>
-        </w:rPr>
-        <w:t xml:space="preserve">על המסך: </w:t>
-      </w:r>
-      <w:r>
-        <w:rPr>
-          <w:rFonts w:ascii="Arial" w:cs="Arial" w:eastAsia="Arial" w:hAnsi="Arial"/>
-          <w:color w:val="8A8F99"/>
-          <w:sz w:val="20"/>
-          <w:szCs w:val="20"/>
-          <w:rtl/>
-        </w:rPr>
-        <w:t xml:space="preserve">תמונה שלך על אלונקה בסורוקה, וכרטיס ההודעה הקולית עם התמליל המלא, שמסתיים ב: אוהב את כולם, נשיקות, נפגש.</w:t>
-      </w:r>
-    </w:p>
-    <w:p>
-      <w:pPr>
-        <w:bidi/>
-        <w:spacing w:after="140" w:line="360"/>
-        <w:jc w:val="right"/>
-      </w:pPr>
-      <w:r>
-        <w:rPr>
-          <w:rFonts w:ascii="Arial" w:cs="Arial" w:eastAsia="Arial" w:hAnsi="Arial"/>
-          <w:sz w:val="26"/>
-          <w:szCs w:val="26"/>
-          <w:rtl/>
-        </w:rPr>
-        <w:t xml:space="preserve">שעתיים אחרי הפינוי, מהמיטה בסורוקה, שלחתי לכולם הודעה קולית.</w:t>
-      </w:r>
-    </w:p>
-    <w:p>
-      <w:pPr>
-        <w:bidi/>
-        <w:spacing w:after="140" w:line="360"/>
-        <w:jc w:val="right"/>
-      </w:pPr>
-      <w:r>
-        <w:rPr>
-          <w:rFonts w:ascii="Arial" w:cs="Arial" w:eastAsia="Arial" w:hAnsi="Arial"/>
-          <w:i/>
-          <w:iCs/>
-          <w:color w:val="8A8F99"/>
-          <w:sz w:val="22"/>
-          <w:szCs w:val="22"/>
-          <w:rtl/>
-        </w:rPr>
-        <w:t xml:space="preserve">(לחיצה – ההודעה מתנגנת עד הסוף)</w:t>
-      </w:r>
-    </w:p>
-    <w:p>
-      <w:pPr>
-        <w:bidi/>
-        <w:spacing w:after="140" w:line="360"/>
-        <w:jc w:val="right"/>
-      </w:pPr>
-      <w:r>
-        <w:rPr>
-          <w:rFonts w:ascii="Arial" w:cs="Arial" w:eastAsia="Arial" w:hAnsi="Arial"/>
-          <w:sz w:val="26"/>
-          <w:szCs w:val="26"/>
-          <w:rtl/>
-        </w:rPr>
-        <w:t xml:space="preserve">באותו רגע חשבתי שהחלק הקשה נגמר.</w:t>
-      </w:r>
-    </w:p>
-    <w:p>
-      <w:pPr>
-        <w:pStyle w:val="Heading2"/>
-        <w:keepNext/>
-        <w:bidi/>
-        <w:spacing w:after="80" w:before="320"/>
-        <w:jc w:val="right"/>
-      </w:pPr>
-      <w:r>
-        <w:rPr>
-          <w:rFonts w:ascii="Arial" w:cs="Arial" w:eastAsia="Arial" w:hAnsi="Arial"/>
-          <w:b/>
-          <w:bCs/>
-          <w:sz w:val="28"/>
-          <w:szCs w:val="28"/>
-          <w:rtl/>
-        </w:rPr>
-        <w:t xml:space="preserve">שקופית 29 – האמת?</w:t>
+        <w:t xml:space="preserve">שקופית 28 – האמת?</w:t>
       </w:r>
     </w:p>
     <w:p>
@@ -2865,7 +2779,7 @@
           <w:szCs w:val="28"/>
           <w:rtl/>
         </w:rPr>
-        <w:t xml:space="preserve">שקופית 30 – פרק 04</w:t>
+        <w:t xml:space="preserve">שקופית 29 – פרק 04</w:t>
       </w:r>
     </w:p>
     <w:p>
@@ -2932,7 +2846,7 @@
           <w:szCs w:val="28"/>
           <w:rtl/>
         </w:rPr>
-        <w:t xml:space="preserve">שקופית 31 – הדבר הכי קשה לא היה הפציעה</w:t>
+        <w:t xml:space="preserve">שקופית 30 – הדבר הכי קשה לא היה הפציעה</w:t>
       </w:r>
     </w:p>
     <w:p>
@@ -3066,7 +2980,7 @@
           <w:szCs w:val="28"/>
           <w:rtl/>
         </w:rPr>
-        <w:t xml:space="preserve">שקופית 32 – מה שאף אחד לא מכין אותך אליו</w:t>
+        <w:t xml:space="preserve">שקופית 31 – מה שאף אחד לא מכין אותך אליו</w:t>
       </w:r>
     </w:p>
     <w:p>
@@ -3197,7 +3111,7 @@
           <w:szCs w:val="28"/>
           <w:rtl/>
         </w:rPr>
-        <w:t xml:space="preserve">שקופית 33 – מאז</w:t>
+        <w:t xml:space="preserve">שקופית 32 – מאז</w:t>
       </w:r>
     </w:p>
     <w:p>
@@ -3293,7 +3207,7 @@
           <w:szCs w:val="28"/>
           <w:rtl/>
         </w:rPr>
-        <w:t xml:space="preserve">שקופית 34 – פרק 05</w:t>
+        <w:t xml:space="preserve">שקופית 33 – פרק 05</w:t>
       </w:r>
     </w:p>
     <w:p>
@@ -3360,7 +3274,7 @@
           <w:szCs w:val="28"/>
           <w:rtl/>
         </w:rPr>
-        <w:t xml:space="preserve">שקופית 35 – שלושה עקרונות לעבור משבר</w:t>
+        <w:t xml:space="preserve">שקופית 34 – שלושה עקרונות לעבור משבר</w:t>
       </w:r>
     </w:p>
     <w:p>
@@ -3427,7 +3341,7 @@
           <w:szCs w:val="28"/>
           <w:rtl/>
         </w:rPr>
-        <w:t xml:space="preserve">שקופית 36 – עיקרון 1</w:t>
+        <w:t xml:space="preserve">שקופית 35 – עיקרון 1</w:t>
       </w:r>
     </w:p>
     <w:p>
@@ -3510,7 +3424,7 @@
           <w:szCs w:val="28"/>
           <w:rtl/>
         </w:rPr>
-        <w:t xml:space="preserve">שקופית 37 – עיקרון 2</w:t>
+        <w:t xml:space="preserve">שקופית 36 – עיקרון 2</w:t>
       </w:r>
     </w:p>
     <w:p>
@@ -3593,7 +3507,7 @@
           <w:szCs w:val="28"/>
           <w:rtl/>
         </w:rPr>
-        <w:t xml:space="preserve">שקופית 38 – עיקרון 3</w:t>
+        <w:t xml:space="preserve">שקופית 37 – עיקרון 3</w:t>
       </w:r>
     </w:p>
     <w:p>
@@ -3705,7 +3619,7 @@
           <w:szCs w:val="28"/>
           <w:rtl/>
         </w:rPr>
-        <w:t xml:space="preserve">שקופית 39 – פרק 06</w:t>
+        <w:t xml:space="preserve">שקופית 38 – פרק 06</w:t>
       </w:r>
     </w:p>
     <w:p>
@@ -3753,6 +3667,70 @@
           <w:rtl/>
         </w:rPr>
         <w:t xml:space="preserve">אז מה עושים עם כל הכאב הזה?</w:t>
+      </w:r>
+    </w:p>
+    <w:p>
+      <w:pPr>
+        <w:bidi/>
+        <w:spacing w:after="140" w:line="360"/>
+        <w:jc w:val="right"/>
+      </w:pPr>
+      <w:r>
+        <w:rPr>
+          <w:rFonts w:ascii="Arial" w:cs="Arial" w:eastAsia="Arial" w:hAnsi="Arial"/>
+          <w:sz w:val="26"/>
+          <w:szCs w:val="26"/>
+          <w:rtl/>
+        </w:rPr>
+        <w:t xml:space="preserve">היום, אחרי השירות, אני ממצה את עצמי עד הקצה. עשיתי הרבה קורסים, התנסיתי בהמון דברים, טיילתי בעולם ועבדתי בכל מיני עבודות. כל אחת מהן לימדה אותי משהו.</w:t>
+      </w:r>
+    </w:p>
+    <w:p>
+      <w:pPr>
+        <w:bidi/>
+        <w:spacing w:after="140" w:line="360"/>
+        <w:jc w:val="right"/>
+      </w:pPr>
+      <w:r>
+        <w:rPr>
+          <w:rFonts w:ascii="Arial" w:cs="Arial" w:eastAsia="Arial" w:hAnsi="Arial"/>
+          <w:sz w:val="26"/>
+          <w:szCs w:val="26"/>
+          <w:rtl/>
+        </w:rPr>
+        <w:t xml:space="preserve">עכשיו אני לומד הנדסאי בניין, ותכף מתחיל ללמוד יזמות וקיימות ברייכמן. יש לי שאיפות גדולות. אני לא יודע את כל הדרך, אבל אני יודע מה הצעד הבא.</w:t>
+      </w:r>
+    </w:p>
+    <w:p>
+      <w:pPr>
+        <w:bidi/>
+        <w:spacing w:after="140" w:line="360"/>
+        <w:jc w:val="right"/>
+      </w:pPr>
+      <w:r>
+        <w:rPr>
+          <w:rFonts w:ascii="Arial" w:cs="Arial" w:eastAsia="Arial" w:hAnsi="Arial"/>
+          <w:sz w:val="26"/>
+          <w:szCs w:val="26"/>
+          <w:rtl/>
+        </w:rPr>
+        <w:t xml:space="preserve">ואני מרצה. למה אני עומד פה מולכם? לא בשביל שירחמו עליי, ולא בשביל שיגידו "איזה גיבור".</w:t>
+      </w:r>
+    </w:p>
+    <w:p>
+      <w:pPr>
+        <w:bidi/>
+        <w:spacing w:after="140" w:line="360"/>
+        <w:jc w:val="right"/>
+      </w:pPr>
+      <w:r>
+        <w:rPr>
+          <w:rFonts w:ascii="Arial" w:cs="Arial" w:eastAsia="Arial" w:hAnsi="Arial"/>
+          <w:sz w:val="26"/>
+          <w:szCs w:val="26"/>
+          <w:rtl/>
+        </w:rPr>
+        <w:t xml:space="preserve">אני מספר לכם את הסיפור שלי, כי אם בן אדם אחד כאן יחליט לקחת אחריות על החיים שלו בגלל משהו שהוא שמע ממני, היה שווה לי לספר אותו.</w:t>
       </w:r>
     </w:p>
     <w:p>
@@ -3772,7 +3750,7 @@
           <w:szCs w:val="28"/>
           <w:rtl/>
         </w:rPr>
-        <w:t xml:space="preserve">שקופית 40 – מה אני עושה עם זה היום</w:t>
+        <w:t xml:space="preserve">שקופית 39 – בוחר מה עושים מכאן</w:t>
       </w:r>
     </w:p>
     <w:p>
@@ -3803,71 +3781,109 @@
           <w:szCs w:val="20"/>
           <w:rtl/>
         </w:rPr>
-        <w:t xml:space="preserve">שישה כרטיסים עם אייקונים: לימודים, עבודה, הרצאות, קורסים והתנסויות, שאיפות, הרצון להתפתח.</w:t>
-      </w:r>
-    </w:p>
-    <w:p>
-      <w:pPr>
-        <w:bidi/>
-        <w:spacing w:after="140" w:line="360"/>
-        <w:jc w:val="right"/>
-      </w:pPr>
-      <w:r>
-        <w:rPr>
-          <w:rFonts w:ascii="Arial" w:cs="Arial" w:eastAsia="Arial" w:hAnsi="Arial"/>
-          <w:sz w:val="26"/>
-          <w:szCs w:val="26"/>
-          <w:rtl/>
-        </w:rPr>
-        <w:t xml:space="preserve">היום, אחרי השירות, אני ממצה את עצמי עד הקצה. עשיתי הרבה קורסים, התנסיתי בהמון דברים, טיילתי בעולם ועבדתי בכל מיני עבודות. כל אחת מהן לימדה אותי משהו.</w:t>
-      </w:r>
-    </w:p>
-    <w:p>
-      <w:pPr>
-        <w:bidi/>
-        <w:spacing w:after="140" w:line="360"/>
-        <w:jc w:val="right"/>
-      </w:pPr>
-      <w:r>
-        <w:rPr>
-          <w:rFonts w:ascii="Arial" w:cs="Arial" w:eastAsia="Arial" w:hAnsi="Arial"/>
-          <w:sz w:val="26"/>
-          <w:szCs w:val="26"/>
-          <w:rtl/>
-        </w:rPr>
-        <w:t xml:space="preserve">עכשיו אני לומד הנדסאי בניין, ותכף מתחיל ללמוד יזמות וקיימות ברייכמן. יש לי שאיפות גדולות. אני לא יודע את כל הדרך, אבל אני יודע מה הצעד הבא.</w:t>
-      </w:r>
-    </w:p>
-    <w:p>
-      <w:pPr>
-        <w:bidi/>
-        <w:spacing w:after="140" w:line="360"/>
-        <w:jc w:val="right"/>
-      </w:pPr>
-      <w:r>
-        <w:rPr>
-          <w:rFonts w:ascii="Arial" w:cs="Arial" w:eastAsia="Arial" w:hAnsi="Arial"/>
-          <w:sz w:val="26"/>
-          <w:szCs w:val="26"/>
-          <w:rtl/>
-        </w:rPr>
-        <w:t xml:space="preserve">ואני מרצה. למה אני עומד פה מולכם? לא בשביל שירחמו עליי, ולא בשביל שיגידו "איזה גיבור".</w:t>
-      </w:r>
-    </w:p>
-    <w:p>
-      <w:pPr>
-        <w:bidi/>
-        <w:spacing w:after="140" w:line="360"/>
-        <w:jc w:val="right"/>
-      </w:pPr>
-      <w:r>
-        <w:rPr>
-          <w:rFonts w:ascii="Arial" w:cs="Arial" w:eastAsia="Arial" w:hAnsi="Arial"/>
-          <w:sz w:val="26"/>
-          <w:szCs w:val="26"/>
-          <w:rtl/>
-        </w:rPr>
-        <w:t xml:space="preserve">אני מספר לכם את הסיפור שלי, כי אם בן אדם אחד כאן יחליט לקחת אחריות על החיים שלו בגלל משהו שהוא שמע ממני, היה שווה לי לספר אותו.</w:t>
+        <w:t xml:space="preserve">בהתחלה שאלתי אתכם איפה הייתם ב־7 באוקטובר · אף אחד מאיתנו לא בחר את היום הזה. בלחיצה: אבל כל אחד מאיתנו. ובלחיצה נוספת, בגדול: בוחר מה עושים מכאן.</w:t>
+      </w:r>
+    </w:p>
+    <w:p>
+      <w:pPr>
+        <w:bidi/>
+        <w:spacing w:after="140" w:line="360"/>
+        <w:jc w:val="right"/>
+      </w:pPr>
+      <w:r>
+        <w:rPr>
+          <w:rFonts w:ascii="Arial" w:cs="Arial" w:eastAsia="Arial" w:hAnsi="Arial"/>
+          <w:sz w:val="26"/>
+          <w:szCs w:val="26"/>
+          <w:rtl/>
+        </w:rPr>
+        <w:t xml:space="preserve">בהתחלה שאלתי אתכם איפה הייתם ב־7 באוקטובר.</w:t>
+      </w:r>
+    </w:p>
+    <w:p>
+      <w:pPr>
+        <w:bidi/>
+        <w:spacing w:after="140" w:line="360"/>
+        <w:jc w:val="right"/>
+      </w:pPr>
+      <w:r>
+        <w:rPr>
+          <w:rFonts w:ascii="Arial" w:cs="Arial" w:eastAsia="Arial" w:hAnsi="Arial"/>
+          <w:sz w:val="26"/>
+          <w:szCs w:val="26"/>
+          <w:rtl/>
+        </w:rPr>
+        <w:t xml:space="preserve">אף אחד מאיתנו לא בחר את היום הזה.</w:t>
+      </w:r>
+    </w:p>
+    <w:p>
+      <w:pPr>
+        <w:bidi/>
+        <w:spacing w:after="140" w:line="360"/>
+        <w:jc w:val="right"/>
+      </w:pPr>
+      <w:r>
+        <w:rPr>
+          <w:rFonts w:ascii="Arial" w:cs="Arial" w:eastAsia="Arial" w:hAnsi="Arial"/>
+          <w:i/>
+          <w:iCs/>
+          <w:color w:val="8A8F99"/>
+          <w:sz w:val="22"/>
+          <w:szCs w:val="22"/>
+          <w:rtl/>
+        </w:rPr>
+        <w:t xml:space="preserve">(לעצור. ללחוץ)</w:t>
+      </w:r>
+    </w:p>
+    <w:p>
+      <w:pPr>
+        <w:bidi/>
+        <w:spacing w:after="140" w:line="360"/>
+        <w:jc w:val="right"/>
+      </w:pPr>
+      <w:r>
+        <w:rPr>
+          <w:rFonts w:ascii="Arial" w:cs="Arial" w:eastAsia="Arial" w:hAnsi="Arial"/>
+          <w:sz w:val="26"/>
+          <w:szCs w:val="26"/>
+          <w:rtl/>
+        </w:rPr>
+        <w:t xml:space="preserve">אבל כל אחד מאיתנו</w:t>
+      </w:r>
+    </w:p>
+    <w:p>
+      <w:pPr>
+        <w:bidi/>
+        <w:spacing w:after="140" w:line="360"/>
+        <w:jc w:val="right"/>
+      </w:pPr>
+      <w:r>
+        <w:rPr>
+          <w:rFonts w:ascii="Arial" w:cs="Arial" w:eastAsia="Arial" w:hAnsi="Arial"/>
+          <w:i/>
+          <w:iCs/>
+          <w:color w:val="8A8F99"/>
+          <w:sz w:val="22"/>
+          <w:szCs w:val="22"/>
+          <w:rtl/>
+        </w:rPr>
+        <w:t xml:space="preserve">(ללחוץ)</w:t>
+      </w:r>
+    </w:p>
+    <w:p>
+      <w:pPr>
+        <w:bidi/>
+        <w:spacing w:after="140" w:line="360"/>
+        <w:jc w:val="right"/>
+      </w:pPr>
+      <w:r>
+        <w:rPr>
+          <w:rFonts w:ascii="Arial" w:cs="Arial" w:eastAsia="Arial" w:hAnsi="Arial"/>
+          <w:sz w:val="26"/>
+          <w:szCs w:val="26"/>
+          <w:rtl/>
+        </w:rPr>
+        <w:t xml:space="preserve">בוחר מה עושים מכאן.</w:t>
       </w:r>
     </w:p>
     <w:p>
@@ -3887,7 +3903,7 @@
           <w:szCs w:val="28"/>
           <w:rtl/>
         </w:rPr>
-        <w:t xml:space="preserve">שקופית 41 – בוחר מה עושים מכאן</w:t>
+        <w:t xml:space="preserve">שקופית 40 – ההחלטה</w:t>
       </w:r>
     </w:p>
     <w:p>
@@ -3918,109 +3934,71 @@
           <w:szCs w:val="20"/>
           <w:rtl/>
         </w:rPr>
-        <w:t xml:space="preserve">בהתחלה שאלתי אתכם איפה הייתם ב־7 באוקטובר · אף אחד מאיתנו לא בחר את היום הזה. בלחיצה: אבל כל אחד מאיתנו. ובלחיצה נוספת, בגדול: בוחר מה עושים מכאן.</w:t>
-      </w:r>
-    </w:p>
-    <w:p>
-      <w:pPr>
-        <w:bidi/>
-        <w:spacing w:after="140" w:line="360"/>
-        <w:jc w:val="right"/>
-      </w:pPr>
-      <w:r>
-        <w:rPr>
-          <w:rFonts w:ascii="Arial" w:cs="Arial" w:eastAsia="Arial" w:hAnsi="Arial"/>
-          <w:sz w:val="26"/>
-          <w:szCs w:val="26"/>
-          <w:rtl/>
-        </w:rPr>
-        <w:t xml:space="preserve">בהתחלה שאלתי אתכם איפה הייתם ב־7 באוקטובר.</w:t>
-      </w:r>
-    </w:p>
-    <w:p>
-      <w:pPr>
-        <w:bidi/>
-        <w:spacing w:after="140" w:line="360"/>
-        <w:jc w:val="right"/>
-      </w:pPr>
-      <w:r>
-        <w:rPr>
-          <w:rFonts w:ascii="Arial" w:cs="Arial" w:eastAsia="Arial" w:hAnsi="Arial"/>
-          <w:sz w:val="26"/>
-          <w:szCs w:val="26"/>
-          <w:rtl/>
-        </w:rPr>
-        <w:t xml:space="preserve">אף אחד מאיתנו לא בחר את היום הזה.</w:t>
-      </w:r>
-    </w:p>
-    <w:p>
-      <w:pPr>
-        <w:bidi/>
-        <w:spacing w:after="140" w:line="360"/>
-        <w:jc w:val="right"/>
-      </w:pPr>
-      <w:r>
-        <w:rPr>
-          <w:rFonts w:ascii="Arial" w:cs="Arial" w:eastAsia="Arial" w:hAnsi="Arial"/>
-          <w:i/>
-          <w:iCs/>
-          <w:color w:val="8A8F99"/>
-          <w:sz w:val="22"/>
-          <w:szCs w:val="22"/>
-          <w:rtl/>
-        </w:rPr>
-        <w:t xml:space="preserve">(לעצור. ללחוץ)</w:t>
-      </w:r>
-    </w:p>
-    <w:p>
-      <w:pPr>
-        <w:bidi/>
-        <w:spacing w:after="140" w:line="360"/>
-        <w:jc w:val="right"/>
-      </w:pPr>
-      <w:r>
-        <w:rPr>
-          <w:rFonts w:ascii="Arial" w:cs="Arial" w:eastAsia="Arial" w:hAnsi="Arial"/>
-          <w:sz w:val="26"/>
-          <w:szCs w:val="26"/>
-          <w:rtl/>
-        </w:rPr>
-        <w:t xml:space="preserve">אבל כל אחד מאיתנו</w:t>
-      </w:r>
-    </w:p>
-    <w:p>
-      <w:pPr>
-        <w:bidi/>
-        <w:spacing w:after="140" w:line="360"/>
-        <w:jc w:val="right"/>
-      </w:pPr>
-      <w:r>
-        <w:rPr>
-          <w:rFonts w:ascii="Arial" w:cs="Arial" w:eastAsia="Arial" w:hAnsi="Arial"/>
-          <w:i/>
-          <w:iCs/>
-          <w:color w:val="8A8F99"/>
-          <w:sz w:val="22"/>
-          <w:szCs w:val="22"/>
-          <w:rtl/>
-        </w:rPr>
-        <w:t xml:space="preserve">(ללחוץ)</w:t>
-      </w:r>
-    </w:p>
-    <w:p>
-      <w:pPr>
-        <w:bidi/>
-        <w:spacing w:after="140" w:line="360"/>
-        <w:jc w:val="right"/>
-      </w:pPr>
-      <w:r>
-        <w:rPr>
-          <w:rFonts w:ascii="Arial" w:cs="Arial" w:eastAsia="Arial" w:hAnsi="Arial"/>
-          <w:sz w:val="26"/>
-          <w:szCs w:val="26"/>
-          <w:rtl/>
-        </w:rPr>
-        <w:t xml:space="preserve">בוחר מה עושים מכאן.</w:t>
+        <w:t xml:space="preserve">ההחלטה הייתה לקחת את ההחלטות בחיים שלי בעצמי, ומתחת שלושה כרטיסים: כיתה י׳ · 7.10 · היום.</w:t>
+      </w:r>
+    </w:p>
+    <w:p>
+      <w:pPr>
+        <w:bidi/>
+        <w:spacing w:after="140" w:line="360"/>
+        <w:jc w:val="right"/>
+      </w:pPr>
+      <w:r>
+        <w:rPr>
+          <w:rFonts w:ascii="Arial" w:cs="Arial" w:eastAsia="Arial" w:hAnsi="Arial"/>
+          <w:sz w:val="26"/>
+          <w:szCs w:val="26"/>
+          <w:rtl/>
+        </w:rPr>
+        <w:t xml:space="preserve">אצלי, ההחלטה הייתה לקחת את ההחלטות בחיים שלי בעצמי. אותה החלטה, שלוש פעמים.</w:t>
+      </w:r>
+    </w:p>
+    <w:p>
+      <w:pPr>
+        <w:bidi/>
+        <w:spacing w:after="140" w:line="360"/>
+        <w:jc w:val="right"/>
+      </w:pPr>
+      <w:r>
+        <w:rPr>
+          <w:rFonts w:ascii="Arial" w:cs="Arial" w:eastAsia="Arial" w:hAnsi="Arial"/>
+          <w:sz w:val="26"/>
+          <w:szCs w:val="26"/>
+          <w:rtl/>
+        </w:rPr>
+        <w:t xml:space="preserve">בכיתה י׳, כשהאשימו אותי, החלטתי לכתוב את הסיפור שלי בעצמי.</w:t>
+      </w:r>
+    </w:p>
+    <w:p>
+      <w:pPr>
+        <w:bidi/>
+        <w:spacing w:after="140" w:line="360"/>
+        <w:jc w:val="right"/>
+      </w:pPr>
+      <w:r>
+        <w:rPr>
+          <w:rFonts w:ascii="Arial" w:cs="Arial" w:eastAsia="Arial" w:hAnsi="Arial"/>
+          <w:sz w:val="26"/>
+          <w:szCs w:val="26"/>
+          <w:rtl/>
+        </w:rPr>
+        <w:t xml:space="preserve">ב־7 באוקטובר, כשנפצעתי, החלטתי לתפקד ולהמשיך.</w:t>
+      </w:r>
+    </w:p>
+    <w:p>
+      <w:pPr>
+        <w:bidi/>
+        <w:spacing w:after="140" w:line="360"/>
+        <w:jc w:val="right"/>
+      </w:pPr>
+      <w:r>
+        <w:rPr>
+          <w:rFonts w:ascii="Arial" w:cs="Arial" w:eastAsia="Arial" w:hAnsi="Arial"/>
+          <w:sz w:val="26"/>
+          <w:szCs w:val="26"/>
+          <w:rtl/>
+        </w:rPr>
+        <w:t xml:space="preserve">והיום, כשהחיים לא חזרו למה שהיו, החלטתי לבנות אותם מחדש.</w:t>
       </w:r>
     </w:p>
     <w:p>
@@ -4040,122 +4018,7 @@
           <w:szCs w:val="28"/>
           <w:rtl/>
         </w:rPr>
-        <w:t xml:space="preserve">שקופית 42 – ההחלטה</w:t>
-      </w:r>
-    </w:p>
-    <w:p>
-      <w:pPr>
-        <w:keepNext/>
-        <w:shd w:fill="F4F1EC" w:color="auto" w:val="clear"/>
-        <w:bidi/>
-        <w:spacing w:after="140"/>
-        <w:jc w:val="right"/>
-      </w:pPr>
-      <w:r>
-        <w:rPr>
-          <w:rFonts w:ascii="Arial" w:cs="Arial" w:eastAsia="Arial" w:hAnsi="Arial"/>
-          <w:b/>
-          <w:bCs/>
-          <w:color w:val="8A8F99"/>
-          <w:sz w:val="20"/>
-          <w:szCs w:val="20"/>
-          <w:rtl/>
-        </w:rPr>
-        <w:t xml:space="preserve">על המסך: </w:t>
-      </w:r>
-      <w:r>
-        <w:rPr>
-          <w:rFonts w:ascii="Arial" w:cs="Arial" w:eastAsia="Arial" w:hAnsi="Arial"/>
-          <w:color w:val="8A8F99"/>
-          <w:sz w:val="20"/>
-          <w:szCs w:val="20"/>
-          <w:rtl/>
-        </w:rPr>
-        <w:t xml:space="preserve">ההחלטה הייתה לקחת את ההחלטות בחיים שלי בעצמי, ומתחת שלושה כרטיסים: כיתה י׳ · 7.10 · היום.</w:t>
-      </w:r>
-    </w:p>
-    <w:p>
-      <w:pPr>
-        <w:bidi/>
-        <w:spacing w:after="140" w:line="360"/>
-        <w:jc w:val="right"/>
-      </w:pPr>
-      <w:r>
-        <w:rPr>
-          <w:rFonts w:ascii="Arial" w:cs="Arial" w:eastAsia="Arial" w:hAnsi="Arial"/>
-          <w:sz w:val="26"/>
-          <w:szCs w:val="26"/>
-          <w:rtl/>
-        </w:rPr>
-        <w:t xml:space="preserve">אצלי, ההחלטה הייתה לקחת את ההחלטות בחיים שלי בעצמי. אותה החלטה, שלוש פעמים.</w:t>
-      </w:r>
-    </w:p>
-    <w:p>
-      <w:pPr>
-        <w:bidi/>
-        <w:spacing w:after="140" w:line="360"/>
-        <w:jc w:val="right"/>
-      </w:pPr>
-      <w:r>
-        <w:rPr>
-          <w:rFonts w:ascii="Arial" w:cs="Arial" w:eastAsia="Arial" w:hAnsi="Arial"/>
-          <w:sz w:val="26"/>
-          <w:szCs w:val="26"/>
-          <w:rtl/>
-        </w:rPr>
-        <w:t xml:space="preserve">בכיתה י׳, כשהאשימו אותי, החלטתי לכתוב את הסיפור שלי בעצמי.</w:t>
-      </w:r>
-    </w:p>
-    <w:p>
-      <w:pPr>
-        <w:bidi/>
-        <w:spacing w:after="140" w:line="360"/>
-        <w:jc w:val="right"/>
-      </w:pPr>
-      <w:r>
-        <w:rPr>
-          <w:rFonts w:ascii="Arial" w:cs="Arial" w:eastAsia="Arial" w:hAnsi="Arial"/>
-          <w:sz w:val="26"/>
-          <w:szCs w:val="26"/>
-          <w:rtl/>
-        </w:rPr>
-        <w:t xml:space="preserve">ב־7 באוקטובר, כשנפצעתי, החלטתי לתפקד ולהמשיך.</w:t>
-      </w:r>
-    </w:p>
-    <w:p>
-      <w:pPr>
-        <w:bidi/>
-        <w:spacing w:after="140" w:line="360"/>
-        <w:jc w:val="right"/>
-      </w:pPr>
-      <w:r>
-        <w:rPr>
-          <w:rFonts w:ascii="Arial" w:cs="Arial" w:eastAsia="Arial" w:hAnsi="Arial"/>
-          <w:sz w:val="26"/>
-          <w:szCs w:val="26"/>
-          <w:rtl/>
-        </w:rPr>
-        <w:t xml:space="preserve">והיום, כשהחיים לא חזרו למה שהיו, החלטתי לבנות אותם מחדש.</w:t>
-      </w:r>
-    </w:p>
-    <w:p>
-      <w:pPr>
-        <w:pStyle w:val="Heading2"/>
-        <w:keepNext/>
-        <w:bidi/>
-        <w:spacing w:after="80" w:before="320"/>
-        <w:jc w:val="right"/>
-      </w:pPr>
-      <w:r>
-        <w:rPr>
-          <w:rFonts w:ascii="Arial" w:cs="Arial" w:eastAsia="Arial" w:hAnsi="Arial"/>
-          <w:b/>
-          <w:bCs/>
-          <w:sz w:val="28"/>
-          <w:szCs w:val="28"/>
-          <w:rtl/>
-        </w:rPr>
-        <w:t xml:space="preserve">שקופית 43 – תודה</w:t>
+        <w:t xml:space="preserve">שקופית 41 – תודה</w:t>
       </w:r>
     </w:p>
     <w:p>

</xml_diff>

<commit_message>
Soccer ball in the two-paths illustration; restore 'what I do with it today' slide (42 slides)
Co-Authored-By: Claude Opus 5.5 <noreply@anthropic.com>
Claude-Session: https://claude.ai/code/session_01VJ4ffGR4QBf998EQw4XNfv
</commit_message>
<xml_diff>
--- a/presentation/lecture-script.docx
+++ b/presentation/lecture-script.docx
@@ -3671,70 +3671,6 @@
     </w:p>
     <w:p>
       <w:pPr>
-        <w:bidi/>
-        <w:spacing w:after="140" w:line="360"/>
-        <w:jc w:val="right"/>
-      </w:pPr>
-      <w:r>
-        <w:rPr>
-          <w:rFonts w:ascii="Arial" w:cs="Arial" w:eastAsia="Arial" w:hAnsi="Arial"/>
-          <w:sz w:val="26"/>
-          <w:szCs w:val="26"/>
-          <w:rtl/>
-        </w:rPr>
-        <w:t xml:space="preserve">היום, אחרי השירות, אני ממצה את עצמי עד הקצה. עשיתי הרבה קורסים, התנסיתי בהמון דברים, טיילתי בעולם ועבדתי בכל מיני עבודות. כל אחת מהן לימדה אותי משהו.</w:t>
-      </w:r>
-    </w:p>
-    <w:p>
-      <w:pPr>
-        <w:bidi/>
-        <w:spacing w:after="140" w:line="360"/>
-        <w:jc w:val="right"/>
-      </w:pPr>
-      <w:r>
-        <w:rPr>
-          <w:rFonts w:ascii="Arial" w:cs="Arial" w:eastAsia="Arial" w:hAnsi="Arial"/>
-          <w:sz w:val="26"/>
-          <w:szCs w:val="26"/>
-          <w:rtl/>
-        </w:rPr>
-        <w:t xml:space="preserve">עכשיו אני לומד הנדסאי בניין, ותכף מתחיל ללמוד יזמות וקיימות ברייכמן. יש לי שאיפות גדולות. אני לא יודע את כל הדרך, אבל אני יודע מה הצעד הבא.</w:t>
-      </w:r>
-    </w:p>
-    <w:p>
-      <w:pPr>
-        <w:bidi/>
-        <w:spacing w:after="140" w:line="360"/>
-        <w:jc w:val="right"/>
-      </w:pPr>
-      <w:r>
-        <w:rPr>
-          <w:rFonts w:ascii="Arial" w:cs="Arial" w:eastAsia="Arial" w:hAnsi="Arial"/>
-          <w:sz w:val="26"/>
-          <w:szCs w:val="26"/>
-          <w:rtl/>
-        </w:rPr>
-        <w:t xml:space="preserve">ואני מרצה. למה אני עומד פה מולכם? לא בשביל שירחמו עליי, ולא בשביל שיגידו "איזה גיבור".</w:t>
-      </w:r>
-    </w:p>
-    <w:p>
-      <w:pPr>
-        <w:bidi/>
-        <w:spacing w:after="140" w:line="360"/>
-        <w:jc w:val="right"/>
-      </w:pPr>
-      <w:r>
-        <w:rPr>
-          <w:rFonts w:ascii="Arial" w:cs="Arial" w:eastAsia="Arial" w:hAnsi="Arial"/>
-          <w:sz w:val="26"/>
-          <w:szCs w:val="26"/>
-          <w:rtl/>
-        </w:rPr>
-        <w:t xml:space="preserve">אני מספר לכם את הסיפור שלי, כי אם בן אדם אחד כאן יחליט לקחת אחריות על החיים שלו בגלל משהו שהוא שמע ממני, היה שווה לי לספר אותו.</w:t>
-      </w:r>
-    </w:p>
-    <w:p>
-      <w:pPr>
         <w:pStyle w:val="Heading2"/>
         <w:keepNext/>
         <w:bidi/>
@@ -3750,7 +3686,122 @@
           <w:szCs w:val="28"/>
           <w:rtl/>
         </w:rPr>
-        <w:t xml:space="preserve">שקופית 39 – בוחר מה עושים מכאן</w:t>
+        <w:t xml:space="preserve">שקופית 39 – מה אני עושה עם זה היום</w:t>
+      </w:r>
+    </w:p>
+    <w:p>
+      <w:pPr>
+        <w:keepNext/>
+        <w:shd w:fill="F4F1EC" w:color="auto" w:val="clear"/>
+        <w:bidi/>
+        <w:spacing w:after="140"/>
+        <w:jc w:val="right"/>
+      </w:pPr>
+      <w:r>
+        <w:rPr>
+          <w:rFonts w:ascii="Arial" w:cs="Arial" w:eastAsia="Arial" w:hAnsi="Arial"/>
+          <w:b/>
+          <w:bCs/>
+          <w:color w:val="8A8F99"/>
+          <w:sz w:val="20"/>
+          <w:szCs w:val="20"/>
+          <w:rtl/>
+        </w:rPr>
+        <w:t xml:space="preserve">על המסך: </w:t>
+      </w:r>
+      <w:r>
+        <w:rPr>
+          <w:rFonts w:ascii="Arial" w:cs="Arial" w:eastAsia="Arial" w:hAnsi="Arial"/>
+          <w:color w:val="8A8F99"/>
+          <w:sz w:val="20"/>
+          <w:szCs w:val="20"/>
+          <w:rtl/>
+        </w:rPr>
+        <w:t xml:space="preserve">שישה כרטיסים עם אייקונים: לימודים, עבודה, הרצאות, קורסים והתנסויות, שאיפות, הרצון להתפתח.</w:t>
+      </w:r>
+    </w:p>
+    <w:p>
+      <w:pPr>
+        <w:bidi/>
+        <w:spacing w:after="140" w:line="360"/>
+        <w:jc w:val="right"/>
+      </w:pPr>
+      <w:r>
+        <w:rPr>
+          <w:rFonts w:ascii="Arial" w:cs="Arial" w:eastAsia="Arial" w:hAnsi="Arial"/>
+          <w:sz w:val="26"/>
+          <w:szCs w:val="26"/>
+          <w:rtl/>
+        </w:rPr>
+        <w:t xml:space="preserve">היום, אחרי השירות, אני ממצה את עצמי עד הקצה. עשיתי הרבה קורסים, התנסיתי בהמון דברים, טיילתי בעולם ועבדתי בכל מיני עבודות. כל אחת מהן לימדה אותי משהו.</w:t>
+      </w:r>
+    </w:p>
+    <w:p>
+      <w:pPr>
+        <w:bidi/>
+        <w:spacing w:after="140" w:line="360"/>
+        <w:jc w:val="right"/>
+      </w:pPr>
+      <w:r>
+        <w:rPr>
+          <w:rFonts w:ascii="Arial" w:cs="Arial" w:eastAsia="Arial" w:hAnsi="Arial"/>
+          <w:sz w:val="26"/>
+          <w:szCs w:val="26"/>
+          <w:rtl/>
+        </w:rPr>
+        <w:t xml:space="preserve">עכשיו אני לומד הנדסאי בניין, ותכף מתחיל ללמוד יזמות וקיימות ברייכמן. יש לי שאיפות גדולות. אני לא יודע את כל הדרך, אבל אני יודע מה הצעד הבא.</w:t>
+      </w:r>
+    </w:p>
+    <w:p>
+      <w:pPr>
+        <w:bidi/>
+        <w:spacing w:after="140" w:line="360"/>
+        <w:jc w:val="right"/>
+      </w:pPr>
+      <w:r>
+        <w:rPr>
+          <w:rFonts w:ascii="Arial" w:cs="Arial" w:eastAsia="Arial" w:hAnsi="Arial"/>
+          <w:sz w:val="26"/>
+          <w:szCs w:val="26"/>
+          <w:rtl/>
+        </w:rPr>
+        <w:t xml:space="preserve">ואני מרצה. למה אני עומד פה מולכם? לא בשביל שירחמו עליי, ולא בשביל שיגידו "איזה גיבור".</w:t>
+      </w:r>
+    </w:p>
+    <w:p>
+      <w:pPr>
+        <w:bidi/>
+        <w:spacing w:after="140" w:line="360"/>
+        <w:jc w:val="right"/>
+      </w:pPr>
+      <w:r>
+        <w:rPr>
+          <w:rFonts w:ascii="Arial" w:cs="Arial" w:eastAsia="Arial" w:hAnsi="Arial"/>
+          <w:sz w:val="26"/>
+          <w:szCs w:val="26"/>
+          <w:rtl/>
+        </w:rPr>
+        <w:t xml:space="preserve">אני מספר לכם את הסיפור שלי, כי אם בן אדם אחד כאן יחליט לקחת אחריות על החיים שלו בגלל משהו שהוא שמע ממני, היה שווה לי לספר אותו.</w:t>
+      </w:r>
+    </w:p>
+    <w:p>
+      <w:pPr>
+        <w:pStyle w:val="Heading2"/>
+        <w:keepNext/>
+        <w:bidi/>
+        <w:spacing w:after="80" w:before="320"/>
+        <w:jc w:val="right"/>
+      </w:pPr>
+      <w:r>
+        <w:rPr>
+          <w:rFonts w:ascii="Arial" w:cs="Arial" w:eastAsia="Arial" w:hAnsi="Arial"/>
+          <w:b/>
+          <w:bCs/>
+          <w:sz w:val="28"/>
+          <w:szCs w:val="28"/>
+          <w:rtl/>
+        </w:rPr>
+        <w:t xml:space="preserve">שקופית 40 – בוחר מה עושים מכאן</w:t>
       </w:r>
     </w:p>
     <w:p>
@@ -3903,7 +3954,7 @@
           <w:szCs w:val="28"/>
           <w:rtl/>
         </w:rPr>
-        <w:t xml:space="preserve">שקופית 40 – ההחלטה</w:t>
+        <w:t xml:space="preserve">שקופית 41 – ההחלטה</w:t>
       </w:r>
     </w:p>
     <w:p>
@@ -4018,7 +4069,7 @@
           <w:szCs w:val="28"/>
           <w:rtl/>
         </w:rPr>
-        <w:t xml:space="preserve">שקופית 41 – תודה</w:t>
+        <w:t xml:space="preserve">שקופית 42 – תודה</w:t>
       </w:r>
     </w:p>
     <w:p>

</xml_diff>